<commit_message>
Publish complete new Faith in the Night blog, DOCX and 15-page illustrated PDF
</commit_message>
<xml_diff>
--- a/dist/library/blog/docs/faith-in-the-night.docx
+++ b/dist/library/blog/docs/faith-in-the-night.docx
@@ -4,62 +4,224 @@
   <w:body>
     <w:p>
       <w:pPr>
-        <w:spacing w:before="120" w:after="80"/>
+        <w:spacing w:before="1280" w:after="0"/>
+        <w:jc w:val="center"/>
+      </w:pPr>
+    </w:p>
+    <w:p>
+      <w:pPr>
+        <w:spacing w:before="0" w:after="280"/>
+        <w:jc w:val="center"/>
       </w:pPr>
       <w:r>
         <w:rPr>
           <w:rFonts w:ascii="Georgia" w:hAnsi="Georgia" w:eastAsia="Georgia" w:cs="Times New Roman"/>
           <w:b/>
           <w:color w:val="8A5A1F"/>
-          <w:sz w:val="18"/>
-          <w:szCs w:val="18"/>
+          <w:spacing w:val="60"/>
+          <w:sz w:val="19"/>
+          <w:szCs w:val="19"/>
         </w:rPr>
-        <w:t xml:space="preserve">THE EIGHTH OF MAR CHESHVAN  ·  RESISEI LAYLA, SIMANIM 5, 27 AND 21</w:t>
+        <w:t xml:space="preserve">A YAHRZEIT ESSAY</w:t>
       </w:r>
     </w:p>
     <w:p>
       <w:pPr>
-        <w:spacing w:after="80" w:line="240" w:lineRule="auto"/>
+        <w:spacing w:before="0" w:after="120" w:line="240" w:lineRule="auto"/>
+        <w:jc w:val="center"/>
       </w:pPr>
       <w:r>
         <w:rPr>
           <w:rFonts w:ascii="Georgia" w:hAnsi="Georgia" w:eastAsia="Georgia" w:cs="Times New Roman"/>
           <w:b/>
           <w:color w:val="222B33"/>
-          <w:sz w:val="60"/>
-          <w:szCs w:val="60"/>
+          <w:sz w:val="88"/>
+          <w:szCs w:val="88"/>
         </w:rPr>
         <w:t xml:space="preserve">Faith in the Night</w:t>
       </w:r>
     </w:p>
     <w:p>
       <w:pPr>
-        <w:spacing w:after="360" w:line="276" w:lineRule="auto"/>
         <w:pBdr>
-          <w:bottom w:val="single" w:sz="12" w:space="12" w:color="C9A66B"/>
+          <w:bottom w:val="single" w:sz="12" w:space="1" w:color="C9A66B"/>
         </w:pBdr>
+        <w:spacing w:before="0" w:after="360"/>
+        <w:ind w:left="4104" w:right="4104"/>
+        <w:jc w:val="center"/>
+      </w:pPr>
+    </w:p>
+    <w:p>
+      <w:pPr>
+        <w:spacing w:before="0" w:after="880" w:line="288" w:lineRule="auto"/>
+        <w:ind w:left="792" w:right="792"/>
+        <w:jc w:val="center"/>
       </w:pPr>
       <w:r>
         <w:rPr>
           <w:rFonts w:ascii="Georgia" w:hAnsi="Georgia" w:eastAsia="Georgia" w:cs="Times New Roman"/>
           <w:i/>
           <w:color w:val="5F666D"/>
-          <w:sz w:val="29"/>
-          <w:szCs w:val="29"/>
+          <w:sz w:val="30"/>
+          <w:szCs w:val="30"/>
         </w:rPr>
-        <w:t xml:space="preserve">What my mother and Rav Tzadok understood about the bigger picture, for the thirty-sixth yahrzeit of Yenta Rivka bas Rav Yaakov Halevi</w:t>
+        <w:t xml:space="preserve">What my mother, Rav Tzadok HaKohen and a dying professor’s last lecture taught me about what really matters, for the thirty-sixth yahrzeit of Yenta Rivka bas Rav Yaakov Halevi</w:t>
+      </w:r>
+    </w:p>
+    <w:p>
+      <w:pPr>
+        <w:spacing w:before="0" w:after="120"/>
+        <w:jc w:val="center"/>
+      </w:pPr>
+      <w:r>
+        <w:rPr>
+          <w:rFonts w:ascii="Georgia" w:hAnsi="Georgia" w:eastAsia="Georgia" w:cs="Times New Roman"/>
+          <w:i/>
+          <w:color w:val="5F666D"/>
+          <w:sz w:val="22"/>
+          <w:szCs w:val="22"/>
+        </w:rPr>
+        <w:t xml:space="preserve">In loving memory of my mother</w:t>
+      </w:r>
+    </w:p>
+    <w:p>
+      <w:pPr>
+        <w:spacing w:before="0" w:after="120"/>
+        <w:jc w:val="center"/>
+      </w:pPr>
+      <w:r>
+        <w:rPr>
+          <w:rFonts w:ascii="Georgia" w:hAnsi="Georgia" w:eastAsia="Georgia" w:cs="Times New Roman"/>
+          <w:b/>
+          <w:color w:val="8A5A1F"/>
+          <w:sz w:val="30"/>
+          <w:szCs w:val="30"/>
+        </w:rPr>
+        <w:t xml:space="preserve">Yenta Rivka bas Rav Yaakov Halevi  ·  Yetta Gutnicki</w:t>
+      </w:r>
+    </w:p>
+    <w:p>
+      <w:pPr>
+        <w:spacing w:before="0" w:after="400"/>
+        <w:jc w:val="center"/>
+      </w:pPr>
+      <w:r>
+        <w:rPr>
+          <w:rFonts w:ascii="Georgia" w:hAnsi="Georgia" w:eastAsia="Georgia" w:cs="Times New Roman"/>
+          <w:color w:val="5F666D"/>
+          <w:sz w:val="20"/>
+          <w:szCs w:val="20"/>
+        </w:rPr>
+        <w:t xml:space="preserve">8 Mar Cheshvan 5751  –  thirty-sixth yahrzeit, 8 Mar Cheshvan 5787</w:t>
+      </w:r>
+    </w:p>
+    <w:p>
+      <w:pPr>
+        <w:bidi/>
+        <w:spacing w:before="0" w:after="80"/>
+        <w:jc w:val="center"/>
+      </w:pPr>
+      <w:r>
+        <w:rPr>
+          <w:rFonts w:ascii="Georgia" w:hAnsi="Georgia" w:eastAsia="Georgia" w:cs="Times New Roman"/>
+          <w:color w:val="8A5A1F"/>
+          <w:sz w:val="28"/>
+          <w:szCs w:val="31"/>
+          <w:rtl/>
+        </w:rPr>
+        <w:t xml:space="preserve">לעילוי נשמת מרת ינטא רבקה בת הרב יעקב הלוי ע״ה</w:t>
+      </w:r>
+    </w:p>
+    <w:p>
+      <w:pPr>
+        <w:bidi/>
+        <w:spacing w:before="0" w:after="80"/>
+        <w:jc w:val="center"/>
+      </w:pPr>
+      <w:r>
+        <w:rPr>
+          <w:rFonts w:ascii="Georgia" w:hAnsi="Georgia" w:eastAsia="Georgia" w:cs="Times New Roman"/>
+          <w:color w:val="8A5A1F"/>
+          <w:sz w:val="28"/>
+          <w:szCs w:val="31"/>
+          <w:rtl/>
+        </w:rPr>
+        <w:t xml:space="preserve">תהא נשמתה צרורה בצרור החיים</w:t>
+      </w:r>
+    </w:p>
+    <w:p>
+      <w:pPr>
+        <w:spacing w:before="880" w:after="0"/>
+        <w:jc w:val="center"/>
+      </w:pPr>
+    </w:p>
+    <w:p>
+      <w:pPr>
+        <w:spacing w:before="0" w:after="80"/>
+        <w:jc w:val="center"/>
+      </w:pPr>
+      <w:r>
+        <w:rPr>
+          <w:rFonts w:ascii="Georgia" w:hAnsi="Georgia" w:eastAsia="Georgia" w:cs="Times New Roman"/>
+          <w:b/>
+          <w:color w:val="222B33"/>
+          <w:spacing w:val="60"/>
+          <w:sz w:val="20"/>
+          <w:szCs w:val="20"/>
+        </w:rPr>
+        <w:t xml:space="preserve">AKIVA GUTNICKI</w:t>
+      </w:r>
+    </w:p>
+    <w:p>
+      <w:pPr>
+        <w:spacing w:before="0" w:after="0"/>
+        <w:jc w:val="center"/>
+      </w:pPr>
+      <w:r>
+        <w:rPr>
+          <w:rFonts w:ascii="Georgia" w:hAnsi="Georgia" w:eastAsia="Georgia" w:cs="Times New Roman"/>
+          <w:i/>
+          <w:color w:val="5F666D"/>
+          <w:sz w:val="19"/>
+          <w:szCs w:val="19"/>
+        </w:rPr>
+        <w:t xml:space="preserve">With teachings from Resisei Layla of Rav Tzadok HaKohen of Lublin, Simanim 5, 27, 24 and 21</w:t>
+      </w:r>
+    </w:p>
+    <w:p>
+      <w:pPr>
+        <w:spacing w:after="0"/>
+      </w:pPr>
+      <w:r>
+        <w:br w:type="page"/>
       </w:r>
     </w:p>
     <w:p>
       <w:pPr>
         <w:pStyle w:val="Heading1"/>
-        <w:spacing w:before="200"/>
+        <w:spacing w:before="0"/>
       </w:pPr>
       <w:r>
         <w:rPr>
           <w:rFonts w:ascii="Georgia" w:hAnsi="Georgia" w:eastAsia="Georgia" w:cs="Times New Roman"/>
         </w:rPr>
-        <w:t xml:space="preserve">Thirty-Six Years</w:t>
+        <w:t xml:space="preserve">The Smile</w:t>
+      </w:r>
+    </w:p>
+    <w:p>
+      <w:pPr>
+        <w:spacing w:before="0" w:after="240" w:line="288" w:lineRule="auto"/>
+        <w:jc w:val="left"/>
+      </w:pPr>
+      <w:r>
+        <w:rPr>
+          <w:rFonts w:ascii="Georgia" w:hAnsi="Georgia" w:eastAsia="Georgia" w:cs="Times New Roman"/>
+          <w:i/>
+          <w:color w:val="222B33"/>
+          <w:sz w:val="32"/>
+          <w:szCs w:val="32"/>
+        </w:rPr>
+        <w:t xml:space="preserve">A week before my mother died, she smiled at me.</w:t>
       </w:r>
     </w:p>
     <w:p>
@@ -67,7 +229,7 @@
         <w:rPr>
           <w:rFonts w:ascii="Georgia" w:hAnsi="Georgia" w:eastAsia="Georgia" w:cs="Times New Roman"/>
         </w:rPr>
-        <w:t xml:space="preserve">I was fourteen when my mother, Yenta Rivka bas Rav Yaakov Halevi, known to everyone as Yetta Gutnicki, passed away. Her yahrzeit, the eighth of Mar Cheshvan, begins this Sunday evening. It will be thirty-six years.</w:t>
+        <w:t xml:space="preserve">I was fourteen, and I had only just learned that she was sick. She had been living with ovarian cancer for five and a half years, and for almost all of that time she had not told us children. Somehow, she knew that I knew. And in that moment she smiled at me and did something deeply personal, something only she could have done. It said more than any words could. It told me that everything was going to be okay.</w:t>
       </w:r>
     </w:p>
     <w:p>
@@ -75,7 +237,7 @@
         <w:rPr>
           <w:rFonts w:ascii="Georgia" w:hAnsi="Georgia" w:eastAsia="Georgia" w:cs="Times New Roman"/>
         </w:rPr>
-        <w:t xml:space="preserve">She had ovarian cancer for five and a half years. I have spent most of my life since trying to say what those years were, and the truest thing I can say is that they were not lost years. My mother loved all of us, and despite the challenges she gave us every ounce of herself, every fiber, so that we would have a great life. She did not give us whatever the illness left over. She gave through it.</w:t>
+        <w:t xml:space="preserve">It was not okay. A week later we lost her. Her name was Yenta Rivka bas Rav Yaakov Halevi, Yetta Gutnicki to everyone who knew her, and her yahrzeit, the eighth of Mar Cheshvan, begins next Sunday evening, October 18. It will be thirty-six years.</w:t>
       </w:r>
     </w:p>
     <w:p>
@@ -88,7 +250,7 @@
         <w:drawing>
           <wp:inline xmlns:a="http://schemas.openxmlformats.org/drawingml/2006/main" xmlns:pic="http://schemas.openxmlformats.org/drawingml/2006/picture">
             <wp:extent cx="4023360" cy="2471302"/>
-            <wp:docPr id="1" name="Picture 1" descr="Photograph preserved from the source essay, or authentic Resisei Layla cover from the Akiva Publishing KDP cover PDF."/>
+            <wp:docPr id="1" name="Picture 1"/>
             <wp:cNvGraphicFramePr>
               <a:graphicFrameLocks noChangeAspect="1"/>
             </wp:cNvGraphicFramePr>
@@ -136,11 +298,24 @@
       </w:r>
     </w:p>
     <w:p>
+      <w:pPr>
+        <w:pBdr>
+          <w:top w:val="single" w:sz="6" w:space="10" w:color="C9A66B"/>
+          <w:bottom w:val="single" w:sz="6" w:space="10" w:color="C9A66B"/>
+        </w:pBdr>
+        <w:spacing w:before="200" w:after="320" w:line="300" w:lineRule="auto"/>
+        <w:ind w:left="1152" w:right="1152"/>
+        <w:jc w:val="center"/>
+      </w:pPr>
       <w:r>
         <w:rPr>
           <w:rFonts w:ascii="Georgia" w:hAnsi="Georgia" w:eastAsia="Georgia" w:cs="Times New Roman"/>
+          <w:i/>
+          <w:color w:val="8A5A1F"/>
+          <w:sz w:val="30"/>
+          <w:szCs w:val="30"/>
         </w:rPr>
-        <w:t xml:space="preserve">More than anything else, she taught us the bigger picture. She treated every second as the most valuable thing there is, and she did not get that from a book. She learned it when her own father passed away young, and she understood from the inside what actually matters in a life and what does not.</w:t>
+        <w:t xml:space="preserve">She was the one who was dying, and she was comforting me.</w:t>
       </w:r>
     </w:p>
     <w:p>
@@ -148,7 +323,7 @@
         <w:rPr>
           <w:rFonts w:ascii="Georgia" w:hAnsi="Georgia" w:eastAsia="Georgia" w:cs="Times New Roman"/>
         </w:rPr>
-        <w:t xml:space="preserve">But the bigger picture for her was never only about time. Her deepest aim, the thing every ounce of effort was pointed at, was that her children would have a real connection to Hashem. She wanted us to know where life comes from and where it is going.</w:t>
+        <w:t xml:space="preserve">I have thought about that smile for most of my life, and I understand it differently now than I did then. She was not promising that there would be no pain, or that things would turn out the way I wanted. She was telling me that we would go on, that her love would hold, and that in the end we would be okay. She was the one who was dying, and she was comforting me.</w:t>
       </w:r>
     </w:p>
     <w:p>
@@ -156,7 +331,15 @@
         <w:rPr>
           <w:rFonts w:ascii="Georgia" w:hAnsi="Georgia" w:eastAsia="Georgia" w:cs="Times New Roman"/>
         </w:rPr>
-        <w:t xml:space="preserve">This year, while working on my edition of </w:t>
+        <w:t xml:space="preserve">I cannot imagine everything she carried in private: the pain, the uncertainty, the effort of being fully present for her family while fighting something so grave. It must have been extraordinarily hard. Yet her first thought was what knowing would do to us. She wanted us to have the gift of simply being her children for as long as she could give it.</w:t>
+      </w:r>
+    </w:p>
+    <w:p>
+      <w:r>
+        <w:rPr>
+          <w:rFonts w:ascii="Georgia" w:hAnsi="Georgia" w:eastAsia="Georgia" w:cs="Times New Roman"/>
+        </w:rPr>
+        <w:t xml:space="preserve">Where does a person find that kind of strength? This year the question led me to three places that have become one story for me: my mother’s own life, a lecture by a dying professor, and the teachings of Rav Tzadok HaKohen of Lublin in </w:t>
       </w:r>
       <w:r>
         <w:rPr>
@@ -169,7 +352,327 @@
         <w:rPr>
           <w:rFonts w:ascii="Georgia" w:hAnsi="Georgia" w:eastAsia="Georgia" w:cs="Times New Roman"/>
         </w:rPr>
-        <w:t xml:space="preserve"> by Rav Tzadok HaKohen of Lublin, I went looking for the teaching that says what she lived. I expected to write about the opening pages. Instead the book pulled me forward to three other places, and in each of them I found my mother’s life described in Rav Tzadok’s language.</w:t>
+        <w:t xml:space="preserve">, the book I have been translating.</w:t>
+      </w:r>
+    </w:p>
+    <w:p>
+      <w:pPr>
+        <w:pStyle w:val="Heading1"/>
+      </w:pPr>
+      <w:r>
+        <w:rPr>
+          <w:rFonts w:ascii="Georgia" w:hAnsi="Georgia" w:eastAsia="Georgia" w:cs="Times New Roman"/>
+        </w:rPr>
+        <w:t xml:space="preserve">Fourteen</w:t>
+      </w:r>
+    </w:p>
+    <w:p>
+      <w:r>
+        <w:rPr>
+          <w:rFonts w:ascii="Georgia" w:hAnsi="Georgia" w:eastAsia="Georgia" w:cs="Times New Roman"/>
+        </w:rPr>
+        <w:t xml:space="preserve">My mother’s instinct to care for others began long before she had children. As I understand it, she was about fourteen when her own father passed away. She was the eldest, and at an age when most young people are still being looked after, she took responsibility for her mother and her younger brother. Even after her mother remarried, she went on looking after her, including the time they lived under one roof. It was not a response to a crisis. It was who she was.</w:t>
+      </w:r>
+    </w:p>
+    <w:p>
+      <w:r>
+        <w:drawing>
+          <wp:anchor distT="0" distB="91440" distL="182880" distR="0" simplePos="0" relativeHeight="251658740" behindDoc="0" locked="0" layoutInCell="1" allowOverlap="0">
+            <wp:simplePos x="0" y="0"/>
+            <wp:positionH relativeFrom="margin">
+              <wp:align>right</wp:align>
+            </wp:positionH>
+            <wp:positionV relativeFrom="paragraph">
+              <wp:posOffset>45720</wp:posOffset>
+            </wp:positionV>
+            <wp:extent cx="2377440" cy="3538728"/>
+            <wp:effectExtent l="0" t="0" r="0" b="0"/>
+            <wp:wrapSquare wrapText="bothSides"/>
+            <wp:docPr id="2" name="Picture 2"/>
+            <wp:cNvGraphicFramePr xmlns:a="http://schemas.openxmlformats.org/drawingml/2006/main">
+              <a:graphicFrameLocks noChangeAspect="1"/>
+            </wp:cNvGraphicFramePr>
+            <a:graphic xmlns:a="http://schemas.openxmlformats.org/drawingml/2006/main" xmlns:pic="http://schemas.openxmlformats.org/drawingml/2006/picture">
+              <a:graphicData uri="http://schemas.openxmlformats.org/drawingml/2006/picture">
+                <pic:pic>
+                  <pic:nvPicPr>
+                    <pic:cNvPr id="0" name="_cap_port1.jpg"/>
+                    <pic:cNvPicPr/>
+                  </pic:nvPicPr>
+                  <pic:blipFill>
+                    <a:blip r:embed="rId10"/>
+                    <a:stretch>
+                      <a:fillRect/>
+                    </a:stretch>
+                  </pic:blipFill>
+                  <pic:spPr>
+                    <a:xfrm>
+                      <a:off x="0" y="0"/>
+                      <a:ext cx="2377440" cy="3538728"/>
+                    </a:xfrm>
+                    <a:prstGeom prst="rect"/>
+                  </pic:spPr>
+                </pic:pic>
+              </a:graphicData>
+            </a:graphic>
+          </wp:anchor>
+        </w:drawing>
+      </w:r>
+      <w:r>
+        <w:rPr>
+          <w:rFonts w:ascii="Georgia" w:hAnsi="Georgia" w:eastAsia="Georgia" w:cs="Times New Roman"/>
+        </w:rPr>
+        <w:t xml:space="preserve">She was fourteen when she lost her father. I was fourteen when I lost her. I did not notice that until I sat down to write this, and I am still sitting with it. What I do know is that a person who learns so young how fragile life is also learns early what actually matters, and she never forgot it.</w:t>
+      </w:r>
+    </w:p>
+    <w:p>
+      <w:r>
+        <w:rPr>
+          <w:rFonts w:ascii="Georgia" w:hAnsi="Georgia" w:eastAsia="Georgia" w:cs="Times New Roman"/>
+        </w:rPr>
+        <w:t xml:space="preserve">When she became a mother, she gave every one of us everything she had. Very little of it was material. It was the feeling that we mattered, that she was thinking about us, that we were held. And beneath all of it was one aim: that her children would have a real connection to Hashem, that we would know where life comes from and where it is going. That was the bigger picture she lived by, and she spent herself giving it to us.</w:t>
+      </w:r>
+    </w:p>
+    <w:p>
+      <w:pPr>
+        <w:pStyle w:val="Heading1"/>
+      </w:pPr>
+      <w:r>
+        <w:rPr>
+          <w:rFonts w:ascii="Georgia" w:hAnsi="Georgia" w:eastAsia="Georgia" w:cs="Times New Roman"/>
+        </w:rPr>
+        <w:t xml:space="preserve">A Manual for Three Children</w:t>
+      </w:r>
+    </w:p>
+    <w:p>
+      <w:r>
+        <w:rPr>
+          <w:rFonts w:ascii="Georgia" w:hAnsi="Georgia" w:eastAsia="Georgia" w:cs="Times New Roman"/>
+        </w:rPr>
+        <w:t xml:space="preserve">There is a lecture I keep coming back to, and it belongs in this story. On September 18, 2007, Randy Pausch, a forty-six-year-old computer science professor at Carnegie Mellon and the father of three small children, spoke in a series that invited professors to imagine their “last lecture.” For most speakers that was a thought experiment. For him it was not. He had pancreatic cancer, and a month earlier his doctors had told him to expect three to six months of good health. He walked on stage, dropped to the floor for one-handed push-ups, and then talked about how to live.</w:t>
+      </w:r>
+    </w:p>
+    <w:tbl>
+      <w:tblPr>
+        <w:tblW w:type="auto" w:w="0"/>
+        <w:jc w:val="center"/>
+        <w:tblLayout w:type="fixed"/>
+        <w:tblLook w:firstColumn="1" w:firstRow="1" w:lastColumn="0" w:lastRow="0" w:noHBand="0" w:noVBand="1" w:val="04A0"/>
+      </w:tblPr>
+      <w:tblGrid>
+        <w:gridCol w:w="5686"/>
+        <w:gridCol w:w="3197"/>
+      </w:tblGrid>
+      <w:tr>
+        <w:trPr>
+          <w:cantSplit/>
+        </w:trPr>
+        <w:tc>
+          <w:tcPr>
+            <w:tcW w:type="dxa" w:w="5687"/>
+          </w:tcPr>
+          <w:p>
+            <w:pPr>
+              <w:keepNext/>
+              <w:spacing w:before="120" w:after="60"/>
+              <w:jc w:val="center"/>
+            </w:pPr>
+            <w:r>
+              <w:drawing>
+                <wp:inline xmlns:a="http://schemas.openxmlformats.org/drawingml/2006/main" xmlns:pic="http://schemas.openxmlformats.org/drawingml/2006/picture">
+                  <wp:extent cx="3464680" cy="2514600"/>
+                  <wp:docPr id="3" name="Picture 3"/>
+                  <wp:cNvGraphicFramePr>
+                    <a:graphicFrameLocks noChangeAspect="1"/>
+                  </wp:cNvGraphicFramePr>
+                  <a:graphic>
+                    <a:graphicData uri="http://schemas.openxmlformats.org/drawingml/2006/picture">
+                      <pic:pic>
+                        <pic:nvPicPr>
+                          <pic:cNvPr id="0" name="plecture.jpg"/>
+                          <pic:cNvPicPr/>
+                        </pic:nvPicPr>
+                        <pic:blipFill>
+                          <a:blip r:embed="rId11"/>
+                          <a:stretch>
+                            <a:fillRect/>
+                          </a:stretch>
+                        </pic:blipFill>
+                        <pic:spPr>
+                          <a:xfrm>
+                            <a:off x="0" y="0"/>
+                            <a:ext cx="3464680" cy="2514600"/>
+                          </a:xfrm>
+                          <a:prstGeom prst="rect"/>
+                        </pic:spPr>
+                      </pic:pic>
+                    </a:graphicData>
+                  </a:graphic>
+                </wp:inline>
+              </w:drawing>
+            </w:r>
+          </w:p>
+          <w:p>
+            <w:pPr>
+              <w:spacing w:after="120" w:line="264" w:lineRule="auto"/>
+              <w:jc w:val="center"/>
+            </w:pPr>
+            <w:r>
+              <w:rPr>
+                <w:rFonts w:ascii="Georgia" w:hAnsi="Georgia" w:eastAsia="Georgia" w:cs="Times New Roman"/>
+                <w:i/>
+                <w:color w:val="5F666D"/>
+                <w:sz w:val="17"/>
+                <w:szCs w:val="17"/>
+              </w:rPr>
+              <w:t xml:space="preserve">Randy Pausch giving his last lecture at Carnegie Mellon, September 2007. Photo courtesy of Carnegie Mellon University / Randy Pausch.</w:t>
+            </w:r>
+          </w:p>
+        </w:tc>
+        <w:tc>
+          <w:tcPr>
+            <w:tcW w:type="dxa" w:w="3198"/>
+          </w:tcPr>
+          <w:p>
+            <w:pPr>
+              <w:keepNext/>
+              <w:spacing w:before="120" w:after="60"/>
+              <w:jc w:val="center"/>
+            </w:pPr>
+            <w:r>
+              <w:drawing>
+                <wp:inline xmlns:a="http://schemas.openxmlformats.org/drawingml/2006/main" xmlns:pic="http://schemas.openxmlformats.org/drawingml/2006/picture">
+                  <wp:extent cx="1884420" cy="2514599"/>
+                  <wp:docPr id="4" name="Picture 4"/>
+                  <wp:cNvGraphicFramePr>
+                    <a:graphicFrameLocks noChangeAspect="1"/>
+                  </wp:cNvGraphicFramePr>
+                  <a:graphic>
+                    <a:graphicData uri="http://schemas.openxmlformats.org/drawingml/2006/picture">
+                      <pic:pic>
+                        <pic:nvPicPr>
+                          <pic:cNvPr id="0" name="pfamily.jpg"/>
+                          <pic:cNvPicPr/>
+                        </pic:nvPicPr>
+                        <pic:blipFill>
+                          <a:blip r:embed="rId12"/>
+                          <a:stretch>
+                            <a:fillRect/>
+                          </a:stretch>
+                        </pic:blipFill>
+                        <pic:spPr>
+                          <a:xfrm>
+                            <a:off x="0" y="0"/>
+                            <a:ext cx="1884420" cy="2514599"/>
+                          </a:xfrm>
+                          <a:prstGeom prst="rect"/>
+                        </pic:spPr>
+                      </pic:pic>
+                    </a:graphicData>
+                  </a:graphic>
+                </wp:inline>
+              </w:drawing>
+            </w:r>
+          </w:p>
+          <w:p>
+            <w:pPr>
+              <w:spacing w:after="120" w:line="264" w:lineRule="auto"/>
+              <w:jc w:val="center"/>
+            </w:pPr>
+            <w:r>
+              <w:rPr>
+                <w:rFonts w:ascii="Georgia" w:hAnsi="Georgia" w:eastAsia="Georgia" w:cs="Times New Roman"/>
+                <w:i/>
+                <w:color w:val="5F666D"/>
+                <w:sz w:val="17"/>
+                <w:szCs w:val="17"/>
+              </w:rPr>
+              <w:t xml:space="preserve">Randy Pausch with his wife, Jai, and their children, Dylan, Logan and Chloe. Image via Wikimedia Commons / Pausch Family Archives.</w:t>
+            </w:r>
+          </w:p>
+        </w:tc>
+      </w:tr>
+    </w:tbl>
+    <w:p>
+      <w:pPr>
+        <w:spacing w:after="40"/>
+      </w:pPr>
+    </w:p>
+    <w:p>
+      <w:r>
+        <w:rPr>
+          <w:rFonts w:ascii="Georgia" w:hAnsi="Georgia" w:eastAsia="Georgia" w:cs="Times New Roman"/>
+        </w:rPr>
+        <w:t xml:space="preserve">That lecture spoke to me personally, more than almost anything I have heard. It did what very few things do: it sorted my life. It set aside everything that does not matter and left standing what does: how you treat people, how you meet the walls in your path, how much of yourself you give to the people you love, and what you leave behind. For me it came close to defining the real meaning of life.</w:t>
+      </w:r>
+    </w:p>
+    <w:p>
+      <w:r>
+        <w:rPr>
+          <w:rFonts w:ascii="Georgia" w:hAnsi="Georgia" w:eastAsia="Georgia" w:cs="Times New Roman"/>
+        </w:rPr>
+        <w:t xml:space="preserve">Pausch deliberately left religion out of his talk, and I will not put Rav Tzadok’s words in his mouth. But three of his ideas went into me like a key into a lock.</w:t>
+      </w:r>
+    </w:p>
+    <w:p>
+      <w:r>
+        <w:rPr>
+          <w:rFonts w:ascii="Georgia" w:hAnsi="Georgia" w:eastAsia="Georgia" w:cs="Times New Roman"/>
+        </w:rPr>
+        <w:t xml:space="preserve">The first is the line everyone remembers: “We cannot change the cards we are dealt, just how we play the hand.” My mother was dealt a hand no one would choose. She played it with warmth, with generosity, and in silence, so that her children would not have to carry it.</w:t>
+      </w:r>
+    </w:p>
+    <w:p>
+      <w:r>
+        <w:rPr>
+          <w:rFonts w:ascii="Georgia" w:hAnsi="Georgia" w:eastAsia="Georgia" w:cs="Times New Roman"/>
+        </w:rPr>
+        <w:t xml:space="preserve">The second is about obstacles. The brick walls in our lives, Pausch said, are there to show how badly we want something. My mother did not treat her illness as a reason to give less. It became the measure of how much she wanted to give.</w:t>
+      </w:r>
+    </w:p>
+    <w:p>
+      <w:pPr>
+        <w:pBdr>
+          <w:top w:val="single" w:sz="6" w:space="10" w:color="C9A66B"/>
+          <w:bottom w:val="single" w:sz="6" w:space="10" w:color="C9A66B"/>
+        </w:pBdr>
+        <w:spacing w:before="200" w:after="320" w:line="300" w:lineRule="auto"/>
+        <w:ind w:left="1152" w:right="1152"/>
+        <w:jc w:val="center"/>
+      </w:pPr>
+      <w:r>
+        <w:rPr>
+          <w:rFonts w:ascii="Georgia" w:hAnsi="Georgia" w:eastAsia="Georgia" w:cs="Times New Roman"/>
+          <w:i/>
+          <w:color w:val="8A5A1F"/>
+          <w:sz w:val="30"/>
+          <w:szCs w:val="30"/>
+        </w:rPr>
+        <w:t xml:space="preserve">I had seen it given once before, without a stage or a camera.</w:t>
+      </w:r>
+    </w:p>
+    <w:p>
+      <w:r>
+        <w:rPr>
+          <w:rFonts w:ascii="Georgia" w:hAnsi="Georgia" w:eastAsia="Georgia" w:cs="Times New Roman"/>
+        </w:rPr>
+        <w:t xml:space="preserve">The third is what he called the head fakes. At the very end he revealed that the lecture had never really been about achieving childhood dreams. It was about how to lead your life. And it had never really been for the more than four hundred people in the room, or for the millions who would watch it later. It was for an audience of three: his children, Dylan, Logan and Chloe. He was leaving them a manual for a life he would not be there to see.</w:t>
+      </w:r>
+    </w:p>
+    <w:p>
+      <w:r>
+        <w:rPr>
+          <w:rFonts w:ascii="Georgia" w:hAnsi="Georgia" w:eastAsia="Georgia" w:cs="Times New Roman"/>
+        </w:rPr>
+        <w:t xml:space="preserve">I think that is why the lecture went so deep in me. I had seen it given once before, without a stage or a camera. My mother gave it, in those five and a half years and in that last smile, and it was addressed to her children. I am one of its audience. And it leaves me with the question I want to follow through the rest of this piece: what goes into the manual? What do you hand a child who will have to live without you?</w:t>
+      </w:r>
+    </w:p>
+    <w:p>
+      <w:r>
+        <w:rPr>
+          <w:rFonts w:ascii="Georgia" w:hAnsi="Georgia" w:eastAsia="Georgia" w:cs="Times New Roman"/>
+        </w:rPr>
+        <w:t xml:space="preserve">Rav Tzadok answers that question more deeply than anyone I know.</w:t>
       </w:r>
     </w:p>
     <w:p>
@@ -188,7 +691,7 @@
         <w:rPr>
           <w:rFonts w:ascii="Georgia" w:hAnsi="Georgia" w:eastAsia="Georgia" w:cs="Times New Roman"/>
         </w:rPr>
-        <w:t xml:space="preserve">Rav Tzadok HaKohen of Lublin was a nineteenth-century Chassidic master, and one of the deepest Jewish thinkers of his age. His own life was not the one anyone would have designed. As I have learned it, his first marriage did not last, and his second marriage never brought children. A man in that position could have written a book of lament. He could also have written a book of bitterness, or explanation, or complaint.</w:t>
+        <w:t xml:space="preserve">Rav Tzadok HaKohen of Lublin (1823–1900) was a Chassidic master and one of the most original Jewish thinkers of his age. His life was not one anyone would have chosen. Some of what follows is documented, and some comes from later biographies and Chassidic tradition, which do not always agree on the details.</w:t>
       </w:r>
     </w:p>
     <w:p>
@@ -196,20 +699,7 @@
         <w:rPr>
           <w:rFonts w:ascii="Georgia" w:hAnsi="Georgia" w:eastAsia="Georgia" w:cs="Times New Roman"/>
         </w:rPr>
-        <w:t xml:space="preserve">He did something else. He understood life on a bigger scale, and he wrote for the Children of Israel: how an ordinary Jew, in an ordinary week of work and worry, can live a real and eternal life. In a very real sense his </w:t>
-      </w:r>
-      <w:r>
-        <w:rPr>
-          <w:rFonts w:ascii="Georgia" w:hAnsi="Georgia" w:eastAsia="Georgia" w:cs="Times New Roman"/>
-          <w:i/>
-        </w:rPr>
-        <w:t xml:space="preserve">sefarim</w:t>
-      </w:r>
-      <w:r>
-        <w:rPr>
-          <w:rFonts w:ascii="Georgia" w:hAnsi="Georgia" w:eastAsia="Georgia" w:cs="Times New Roman"/>
-        </w:rPr>
-        <w:t xml:space="preserve"> became his children. And what comes through in everything he wrote is the same thing underneath it all: a settled joy, and an unshakable sense that everything comes from Hashem.</w:t>
+        <w:t xml:space="preserve">He was born in Kreuzburg, in present-day Latvia, where his father was the rabbi. When he was about six his father died, and he was raised in the home of his uncle, Rav Yosef HaKohen Rabinowitz. He threw himself into Torah and became known as the prodigy of Krinik. He married at about fifteen, and within a few years the marriage fell apart. The sources on what happened are painful and uncertain, and it would be wrong to assign blame. But the journeys that grew out of that crisis brought him into the Chassidic world, and to Rav Mordechai Yosef Leiner of Izbica, whose teaching changed the course of his life.</w:t>
       </w:r>
     </w:p>
     <w:p>
@@ -217,7 +707,108 @@
         <w:rPr>
           <w:rFonts w:ascii="Georgia" w:hAnsi="Georgia" w:eastAsia="Georgia" w:cs="Times New Roman"/>
         </w:rPr>
-        <w:t xml:space="preserve">The name of this book carries the whole idea. </w:t>
+        <w:t xml:space="preserve">He then married Chana Devorah, and for decades he turned down rabbinic positions so that he could keep learning and writing. They lived in real poverty; according to his biographers, she kept the household going with a small used-clothing shop. He married three times and never had children of his own, though he helped support and raise his wife’s children from an earlier marriage. Only in 1888, at about sixty-five, after the passing of Rav Yehudah Leib Eiger, did he agree to lead the Chassidim of Lublin.</w:t>
+      </w:r>
+    </w:p>
+    <w:p>
+      <w:r>
+        <w:rPr>
+          <w:rFonts w:ascii="Georgia" w:hAnsi="Georgia" w:eastAsia="Georgia" w:cs="Times New Roman"/>
+        </w:rPr>
+        <w:t xml:space="preserve">A man with that life could have written books of grief, or bitterness, or complaint. He wrote none of them. What he left is a body of Torah full of hope, dignity and joy. One line from his </w:t>
+      </w:r>
+      <w:r>
+        <w:rPr>
+          <w:rFonts w:ascii="Georgia" w:hAnsi="Georgia" w:eastAsia="Georgia" w:cs="Times New Roman"/>
+          <w:i/>
+        </w:rPr>
+        <w:t xml:space="preserve">Tzidkas HaTzadik</w:t>
+      </w:r>
+      <w:r>
+        <w:rPr>
+          <w:rFonts w:ascii="Georgia" w:hAnsi="Georgia" w:eastAsia="Georgia" w:cs="Times New Roman"/>
+        </w:rPr>
+        <w:t xml:space="preserve"> seems to me to hold the secret of how.</w:t>
+      </w:r>
+    </w:p>
+    <w:p>
+      <w:pPr>
+        <w:keepNext/>
+        <w:keepLines/>
+        <w:pBdr>
+          <w:left w:val="single" w:sz="18" w:space="10" w:color="C9A66B"/>
+        </w:pBdr>
+        <w:shd w:val="clear" w:color="auto" w:fill="F6F1E7"/>
+        <w:spacing w:before="120" w:after="0"/>
+        <w:ind w:left="504" w:right="288"/>
+      </w:pPr>
+      <w:r>
+        <w:rPr>
+          <w:rFonts w:ascii="Georgia" w:hAnsi="Georgia" w:eastAsia="Georgia" w:cs="Times New Roman"/>
+          <w:sz w:val="22"/>
+          <w:szCs w:val="22"/>
+        </w:rPr>
+        <w:t xml:space="preserve">“Just as a person must believe in Hashem, so too must he subsequently believe in himself.”</w:t>
+      </w:r>
+    </w:p>
+    <w:p>
+      <w:pPr>
+        <w:keepNext/>
+        <w:pBdr>
+          <w:left w:val="single" w:sz="18" w:space="10" w:color="C9A66B"/>
+        </w:pBdr>
+        <w:shd w:val="clear" w:color="auto" w:fill="F6F1E7"/>
+        <w:bidi/>
+        <w:spacing w:before="0" w:after="0" w:line="312" w:lineRule="auto"/>
+        <w:ind w:left="288" w:right="504"/>
+      </w:pPr>
+      <w:r>
+        <w:rPr>
+          <w:rFonts w:ascii="Georgia" w:hAnsi="Georgia" w:eastAsia="Georgia" w:cs="Times New Roman"/>
+          <w:b/>
+          <w:bCs/>
+          <w:color w:val="222B33"/>
+          <w:sz w:val="24"/>
+          <w:szCs w:val="27"/>
+          <w:rtl/>
+        </w:rPr>
+        <w:t xml:space="preserve">כְּשֵׁם שֶׁצָּרִיךְ אָדָם לְהַאֲמִין בַּהַשֵּׁם יִתְבָּרַךְ, כָּךְ צָרִיךְ אַחַר כָּךְ לְהַאֲמִין בְּעַצְמוֹ.</w:t>
+      </w:r>
+    </w:p>
+    <w:p>
+      <w:pPr>
+        <w:pBdr>
+          <w:left w:val="single" w:sz="18" w:space="10" w:color="C9A66B"/>
+        </w:pBdr>
+        <w:shd w:val="clear" w:color="auto" w:fill="F6F1E7"/>
+        <w:spacing w:before="0" w:after="240"/>
+        <w:ind w:left="504" w:right="288"/>
+      </w:pPr>
+      <w:r>
+        <w:rPr>
+          <w:rFonts w:ascii="Georgia" w:hAnsi="Georgia" w:eastAsia="Georgia" w:cs="Times New Roman"/>
+          <w:b/>
+          <w:color w:val="8A5A1F"/>
+          <w:sz w:val="19"/>
+          <w:szCs w:val="19"/>
+        </w:rPr>
+        <w:t xml:space="preserve">— Tzidkas HaTzadik, Siman 154</w:t>
+      </w:r>
+    </w:p>
+    <w:p>
+      <w:r>
+        <w:rPr>
+          <w:rFonts w:ascii="Georgia" w:hAnsi="Georgia" w:eastAsia="Georgia" w:cs="Times New Roman"/>
+        </w:rPr>
+        <w:t xml:space="preserve">First you believe in Hashem. Then you believe that your own life matters to Him: that even when it has not turned out as you hoped, it is not wasted, because Hashem has a purpose with you. That is not self-esteem in the usual sense. It grows out of faith. And it is exactly what my mother taught her children, without ever needing to put it into words.</w:t>
+      </w:r>
+    </w:p>
+    <w:p>
+      <w:r>
+        <w:rPr>
+          <w:rFonts w:ascii="Georgia" w:hAnsi="Georgia" w:eastAsia="Georgia" w:cs="Times New Roman"/>
+        </w:rPr>
+        <w:t xml:space="preserve">The title of the book I have been translating carries the whole idea. </w:t>
       </w:r>
       <w:r>
         <w:rPr>
@@ -230,7 +821,7 @@
         <w:rPr>
           <w:rFonts w:ascii="Georgia" w:hAnsi="Georgia" w:eastAsia="Georgia" w:cs="Times New Roman"/>
         </w:rPr>
-        <w:t xml:space="preserve"> means “the droplets of the night,” from the Song of Songs: “my head is filled with dew, my locks with the drops of the night.”</w:t>
+        <w:t xml:space="preserve"> means “droplets of the night,” from the Song of Songs: “my head is filled with dew, my locks with the drops of the night.”</w:t>
       </w:r>
       <w:r>
         <w:rPr>
@@ -243,80 +834,37 @@
         <w:rPr>
           <w:rFonts w:ascii="Georgia" w:hAnsi="Georgia" w:eastAsia="Georgia" w:cs="Times New Roman"/>
         </w:rPr>
-        <w:t xml:space="preserve"> It is a book of small drops of light, gathered in the dark.</w:t>
+        <w:t xml:space="preserve"> It is a book of small drops of light, gathered in the dark. In it I found four teachings that describe my mother’s life.</w:t>
       </w:r>
     </w:p>
     <w:p>
       <w:pPr>
-        <w:spacing w:before="200" w:after="60"/>
-        <w:jc w:val="center"/>
-      </w:pPr>
-      <w:r>
-        <w:drawing>
-          <wp:inline xmlns:a="http://schemas.openxmlformats.org/drawingml/2006/main" xmlns:pic="http://schemas.openxmlformats.org/drawingml/2006/picture">
-            <wp:extent cx="5257800" cy="3698801"/>
-            <wp:docPr id="9" name="Picture 9" descr="Photograph preserved from the source essay, or authentic Resisei Layla cover from the Akiva Publishing KDP cover PDF."/>
-            <wp:cNvGraphicFramePr>
-              <a:graphicFrameLocks noChangeAspect="1"/>
-            </wp:cNvGraphicFramePr>
-            <a:graphic>
-              <a:graphicData uri="http://schemas.openxmlformats.org/drawingml/2006/picture">
-                <pic:pic>
-                  <pic:nvPicPr>
-                    <pic:cNvPr id="0" name="Resisei_Layla_Two_Volume_Authentic_Covers.jpg"/>
-                    <pic:cNvPicPr/>
-                  </pic:nvPicPr>
-                  <pic:blipFill>
-                    <a:blip r:embed="rId21"/>
-                    <a:stretch>
-                      <a:fillRect/>
-                    </a:stretch>
-                  </pic:blipFill>
-                  <pic:spPr>
-                    <a:xfrm>
-                      <a:off x="0" y="0"/>
-                      <a:ext cx="5257800" cy="3698801"/>
-                    </a:xfrm>
-                    <a:prstGeom prst="rect"/>
-                  </pic:spPr>
-                </pic:pic>
-              </a:graphicData>
-            </a:graphic>
-          </wp:inline>
-        </w:drawing>
-      </w:r>
-    </w:p>
-    <w:p>
-      <w:pPr>
-        <w:spacing w:before="40" w:after="300"/>
-        <w:jc w:val="center"/>
+        <w:keepNext/>
+        <w:spacing w:before="520" w:after="60"/>
+        <w:jc w:val="left"/>
       </w:pPr>
       <w:r>
         <w:rPr>
-          <w:i/>
-          <w:color w:val="73583C"/>
-          <w:sz w:val="18"/>
+          <w:rFonts w:ascii="Georgia" w:hAnsi="Georgia" w:eastAsia="Georgia" w:cs="Times New Roman"/>
+          <w:b/>
+          <w:color w:val="5F666D"/>
+          <w:spacing w:val="40"/>
+          <w:sz w:val="17"/>
+          <w:szCs w:val="17"/>
         </w:rPr>
-        <w:t>Resisei Layla, Volumes I and II — the published Akiva Publishing editions.</w:t>
-      </w:r>
-    </w:p>
-    <w:p>
-      <w:r>
-        <w:rPr>
-          <w:rFonts w:ascii="Georgia" w:hAnsi="Georgia" w:eastAsia="Georgia" w:cs="Times New Roman"/>
-        </w:rPr>
-        <w:t xml:space="preserve">That is what I want to share with you in my mother’s memory, in three parts. They come from Simanim 5, 27 and 21.</w:t>
+        <w:t xml:space="preserve">RESISEI LAYLA  ·  SIMAN 5</w:t>
       </w:r>
     </w:p>
     <w:p>
       <w:pPr>
         <w:pStyle w:val="Heading1"/>
+        <w:spacing w:before="0"/>
       </w:pPr>
       <w:r>
         <w:rPr>
           <w:rFonts w:ascii="Georgia" w:hAnsi="Georgia" w:eastAsia="Georgia" w:cs="Times New Roman"/>
         </w:rPr>
-        <w:t xml:space="preserve">Faith Is the Work: Siman 5</w:t>
+        <w:t xml:space="preserve">Faith Is the Work</w:t>
       </w:r>
     </w:p>
     <w:p>
@@ -331,12 +879,12 @@
       <w:pPr>
         <w:keepNext/>
         <w:keepLines/>
-        <w:spacing w:before="120" w:after="0"/>
-        <w:ind w:left="504" w:right="288"/>
         <w:pBdr>
           <w:left w:val="single" w:sz="18" w:space="10" w:color="C9A66B"/>
         </w:pBdr>
         <w:shd w:val="clear" w:color="auto" w:fill="F6F1E7"/>
+        <w:spacing w:before="120" w:after="0"/>
+        <w:ind w:left="504" w:right="288"/>
       </w:pPr>
       <w:r>
         <w:rPr>
@@ -350,13 +898,13 @@
     <w:p>
       <w:pPr>
         <w:keepNext/>
-        <w:bidi/>
-        <w:spacing w:before="0" w:after="0" w:line="312" w:lineRule="auto"/>
-        <w:ind w:left="288" w:right="504"/>
         <w:pBdr>
           <w:left w:val="single" w:sz="18" w:space="10" w:color="C9A66B"/>
         </w:pBdr>
         <w:shd w:val="clear" w:color="auto" w:fill="F6F1E7"/>
+        <w:bidi/>
+        <w:spacing w:before="0" w:after="0" w:line="312" w:lineRule="auto"/>
+        <w:ind w:left="288" w:right="504"/>
       </w:pPr>
       <w:r>
         <w:rPr>
@@ -373,12 +921,12 @@
     </w:p>
     <w:p>
       <w:pPr>
-        <w:spacing w:before="0" w:after="240"/>
-        <w:ind w:left="504" w:right="288"/>
         <w:pBdr>
           <w:left w:val="single" w:sz="18" w:space="10" w:color="C9A66B"/>
         </w:pBdr>
         <w:shd w:val="clear" w:color="auto" w:fill="F6F1E7"/>
+        <w:spacing w:before="0" w:after="240"/>
+        <w:ind w:left="504" w:right="288"/>
       </w:pPr>
       <w:r>
         <w:rPr>
@@ -422,7 +970,7 @@
         <w:rPr>
           <w:rFonts w:ascii="Georgia" w:hAnsi="Georgia" w:eastAsia="Georgia" w:cs="Times New Roman"/>
         </w:rPr>
-        <w:t xml:space="preserve">. Faith is the job. He then ties it to a verse from the Psalm for Shabbos: “And Your faithfulness in the nights.”</w:t>
+        <w:t xml:space="preserve">. Faith is the job. He ties it to the verse in the Psalm for Shabbos: “And Your faithfulness in the nights.”</w:t>
       </w:r>
       <w:r>
         <w:rPr>
@@ -435,7 +983,7 @@
         <w:rPr>
           <w:rFonts w:ascii="Georgia" w:hAnsi="Georgia" w:eastAsia="Georgia" w:cs="Times New Roman"/>
         </w:rPr>
-        <w:t xml:space="preserve"> Rav Tzadok notes that this world is compared to night.</w:t>
+        <w:t xml:space="preserve"> This world, he says, is compared to night.</w:t>
       </w:r>
       <w:r>
         <w:rPr>
@@ -456,19 +1004,19 @@
         <w:rPr>
           <w:rFonts w:ascii="Georgia" w:hAnsi="Georgia" w:eastAsia="Georgia" w:cs="Times New Roman"/>
         </w:rPr>
-        <w:t xml:space="preserve">And what does that trust sound like, in the moments when it is hardest to hold? Rav Tzadok gives a counsel so simple that it is easy to read past.</w:t>
+        <w:t xml:space="preserve">And what does that trust sound like when it is hardest to hold? Rav Tzadok gives a counsel so simple that it is easy to read past.</w:t>
       </w:r>
     </w:p>
     <w:p>
       <w:pPr>
         <w:keepNext/>
         <w:keepLines/>
-        <w:spacing w:before="120" w:after="0"/>
-        <w:ind w:left="504" w:right="288"/>
         <w:pBdr>
           <w:left w:val="single" w:sz="18" w:space="10" w:color="C9A66B"/>
         </w:pBdr>
         <w:shd w:val="clear" w:color="auto" w:fill="F6F1E7"/>
+        <w:spacing w:before="120" w:after="0"/>
+        <w:ind w:left="504" w:right="288"/>
       </w:pPr>
       <w:r>
         <w:rPr>
@@ -482,13 +1030,13 @@
     <w:p>
       <w:pPr>
         <w:keepNext/>
-        <w:bidi/>
-        <w:spacing w:before="0" w:after="0" w:line="312" w:lineRule="auto"/>
-        <w:ind w:left="288" w:right="504"/>
         <w:pBdr>
           <w:left w:val="single" w:sz="18" w:space="10" w:color="C9A66B"/>
         </w:pBdr>
         <w:shd w:val="clear" w:color="auto" w:fill="F6F1E7"/>
+        <w:bidi/>
+        <w:spacing w:before="0" w:after="0" w:line="312" w:lineRule="auto"/>
+        <w:ind w:left="288" w:right="504"/>
       </w:pPr>
       <w:r>
         <w:rPr>
@@ -505,12 +1053,12 @@
     </w:p>
     <w:p>
       <w:pPr>
-        <w:spacing w:before="0" w:after="240"/>
-        <w:ind w:left="504" w:right="288"/>
         <w:pBdr>
           <w:left w:val="single" w:sz="18" w:space="10" w:color="C9A66B"/>
         </w:pBdr>
         <w:shd w:val="clear" w:color="auto" w:fill="F6F1E7"/>
+        <w:spacing w:before="0" w:after="240"/>
+        <w:ind w:left="504" w:right="288"/>
       </w:pPr>
       <w:r>
         <w:rPr>
@@ -528,7 +1076,7 @@
         <w:rPr>
           <w:rFonts w:ascii="Georgia" w:hAnsi="Georgia" w:eastAsia="Georgia" w:cs="Times New Roman"/>
         </w:rPr>
-        <w:t xml:space="preserve">Everything is from Hashem. He does not say it will feel good, or that it will be understood. He says to hold on to that one thing at the very least, while the rest of life is at its most absorbing and its most dark. He describes a person who “receives his sustenance and his pleasures from Hashem, even while his work is down in obscurity,” and he applies to such a person the verse “the righteous shall live by his faith.”</w:t>
+        <w:t xml:space="preserve">Everything is from Hashem. He does not say that it will feel good, or that it will be understood. He says to hold on to that one thing, at the very least, while life is at its most absorbing and its darkest. He describes a person who receives his enjoyments from Hashem “even while his work is in darkness,” and to such a person he applies the verse “the righteous shall live by his faith.”</w:t>
       </w:r>
       <w:r>
         <w:rPr>
@@ -542,12 +1090,12 @@
       <w:pPr>
         <w:keepNext/>
         <w:keepLines/>
-        <w:spacing w:before="120" w:after="0"/>
-        <w:ind w:left="504" w:right="288"/>
         <w:pBdr>
           <w:left w:val="single" w:sz="18" w:space="10" w:color="C9A66B"/>
         </w:pBdr>
         <w:shd w:val="clear" w:color="auto" w:fill="F6F1E7"/>
+        <w:spacing w:before="120" w:after="0"/>
+        <w:ind w:left="504" w:right="288"/>
       </w:pPr>
       <w:r>
         <w:rPr>
@@ -561,13 +1109,13 @@
     <w:p>
       <w:pPr>
         <w:keepNext/>
-        <w:bidi/>
-        <w:spacing w:before="0" w:after="0" w:line="312" w:lineRule="auto"/>
-        <w:ind w:left="288" w:right="504"/>
         <w:pBdr>
           <w:left w:val="single" w:sz="18" w:space="10" w:color="C9A66B"/>
         </w:pBdr>
         <w:shd w:val="clear" w:color="auto" w:fill="F6F1E7"/>
+        <w:bidi/>
+        <w:spacing w:before="0" w:after="0" w:line="312" w:lineRule="auto"/>
+        <w:ind w:left="288" w:right="504"/>
       </w:pPr>
       <w:r>
         <w:rPr>
@@ -584,12 +1132,12 @@
     </w:p>
     <w:p>
       <w:pPr>
-        <w:spacing w:before="0" w:after="240"/>
-        <w:ind w:left="504" w:right="288"/>
         <w:pBdr>
           <w:left w:val="single" w:sz="18" w:space="10" w:color="C9A66B"/>
         </w:pBdr>
         <w:shd w:val="clear" w:color="auto" w:fill="F6F1E7"/>
+        <w:spacing w:before="0" w:after="240"/>
+        <w:ind w:left="504" w:right="288"/>
       </w:pPr>
       <w:r>
         <w:rPr>
@@ -607,7 +1155,7 @@
         <w:rPr>
           <w:rFonts w:ascii="Georgia" w:hAnsi="Georgia" w:eastAsia="Georgia" w:cs="Times New Roman"/>
         </w:rPr>
-        <w:t xml:space="preserve">Rav Tzadok even tells us what the practice looks like in daily life. It is the blessing. When we say </w:t>
+        <w:t xml:space="preserve">Rav Tzadok even tells us what the practice looks like in an ordinary day. It is the blessing. When we say </w:t>
       </w:r>
       <w:r>
         <w:rPr>
@@ -620,7 +1168,7 @@
         <w:rPr>
           <w:rFonts w:ascii="Georgia" w:hAnsi="Georgia" w:eastAsia="Georgia" w:cs="Times New Roman"/>
         </w:rPr>
-        <w:t xml:space="preserve">, “Blessed are You,” we switch from talking about God to talking </w:t>
+        <w:t xml:space="preserve">, “Blessed are You,” we turn from speaking about God to speaking </w:t>
       </w:r>
       <w:r>
         <w:rPr>
@@ -633,19 +1181,19 @@
         <w:rPr>
           <w:rFonts w:ascii="Georgia" w:hAnsi="Georgia" w:eastAsia="Georgia" w:cs="Times New Roman"/>
         </w:rPr>
-        <w:t xml:space="preserve"> Him, in the second person. He explains that the Sages instituted the blessing so that, before a person sinks into any pleasure, he stops and addresses the Giver directly, and recognizes that all of it comes from Him.</w:t>
+        <w:t xml:space="preserve"> Him. Before a person sinks into any pleasure, he stops and addresses the Giver directly.</w:t>
       </w:r>
     </w:p>
     <w:p>
       <w:pPr>
         <w:keepNext/>
         <w:keepLines/>
-        <w:spacing w:before="120" w:after="0"/>
-        <w:ind w:left="504" w:right="288"/>
         <w:pBdr>
           <w:left w:val="single" w:sz="18" w:space="10" w:color="C9A66B"/>
         </w:pBdr>
         <w:shd w:val="clear" w:color="auto" w:fill="F6F1E7"/>
+        <w:spacing w:before="120" w:after="0"/>
+        <w:ind w:left="504" w:right="288"/>
       </w:pPr>
       <w:r>
         <w:rPr>
@@ -659,13 +1207,13 @@
     <w:p>
       <w:pPr>
         <w:keepNext/>
-        <w:bidi/>
-        <w:spacing w:before="0" w:after="0" w:line="312" w:lineRule="auto"/>
-        <w:ind w:left="288" w:right="504"/>
         <w:pBdr>
           <w:left w:val="single" w:sz="18" w:space="10" w:color="C9A66B"/>
         </w:pBdr>
         <w:shd w:val="clear" w:color="auto" w:fill="F6F1E7"/>
+        <w:bidi/>
+        <w:spacing w:before="0" w:after="0" w:line="312" w:lineRule="auto"/>
+        <w:ind w:left="288" w:right="504"/>
       </w:pPr>
       <w:r>
         <w:rPr>
@@ -682,12 +1230,12 @@
     </w:p>
     <w:p>
       <w:pPr>
-        <w:spacing w:before="0" w:after="240"/>
-        <w:ind w:left="504" w:right="288"/>
         <w:pBdr>
           <w:left w:val="single" w:sz="18" w:space="10" w:color="C9A66B"/>
         </w:pBdr>
         <w:shd w:val="clear" w:color="auto" w:fill="F6F1E7"/>
+        <w:spacing w:before="0" w:after="240"/>
+        <w:ind w:left="504" w:right="288"/>
       </w:pPr>
       <w:r>
         <w:rPr>
@@ -701,60 +1249,41 @@
       </w:r>
     </w:p>
     <w:p>
-      <w:pPr>
-        <w:keepNext/>
-        <w:spacing w:before="160" w:after="40"/>
-        <w:jc w:val="center"/>
-      </w:pPr>
       <w:r>
-        <w:drawing>
-          <wp:inline xmlns:a="http://schemas.openxmlformats.org/drawingml/2006/main" xmlns:pic="http://schemas.openxmlformats.org/drawingml/2006/picture">
-            <wp:extent cx="2743200" cy="3832104"/>
-            <wp:docPr id="2" name="Picture 2" descr="Photograph preserved from the source essay, or authentic Resisei Layla cover from the Akiva Publishing KDP cover PDF."/>
-            <wp:cNvGraphicFramePr>
-              <a:graphicFrameLocks noChangeAspect="1"/>
-            </wp:cNvGraphicFramePr>
-            <a:graphic>
-              <a:graphicData uri="http://schemas.openxmlformats.org/drawingml/2006/picture">
-                <pic:pic>
-                  <pic:nvPicPr>
-                    <pic:cNvPr id="0" name="port1.jpg"/>
-                    <pic:cNvPicPr/>
-                  </pic:nvPicPr>
-                  <pic:blipFill>
-                    <a:blip r:embed="rId10"/>
-                    <a:stretch>
-                      <a:fillRect/>
-                    </a:stretch>
-                  </pic:blipFill>
-                  <pic:spPr>
-                    <a:xfrm>
-                      <a:off x="0" y="0"/>
-                      <a:ext cx="2743200" cy="3832104"/>
-                    </a:xfrm>
-                    <a:prstGeom prst="rect"/>
-                  </pic:spPr>
-                </pic:pic>
-              </a:graphicData>
-            </a:graphic>
-          </wp:inline>
-        </w:drawing>
+        <w:rPr>
+          <w:rFonts w:ascii="Georgia" w:hAnsi="Georgia" w:eastAsia="Georgia" w:cs="Times New Roman"/>
+        </w:rPr>
+        <w:t xml:space="preserve">My mother lived inside that night. She did not treat the hard years as a pause to be endured until real life resumed. She treated them as life, and she never stopped giving. Looking back, I believe her smile at the end was that faith made visible: the simple faith, held on to in the dark, that everything comes from Hashem.</w:t>
       </w:r>
     </w:p>
     <w:p>
       <w:pPr>
-        <w:spacing w:after="240"/>
-        <w:jc w:val="center"/>
+        <w:keepNext/>
+        <w:spacing w:before="520" w:after="60"/>
+        <w:jc w:val="left"/>
       </w:pPr>
       <w:r>
         <w:rPr>
           <w:rFonts w:ascii="Georgia" w:hAnsi="Georgia" w:eastAsia="Georgia" w:cs="Times New Roman"/>
-          <w:i/>
+          <w:b/>
           <w:color w:val="5F666D"/>
-          <w:sz w:val="19"/>
-          <w:szCs w:val="19"/>
+          <w:spacing w:val="40"/>
+          <w:sz w:val="17"/>
+          <w:szCs w:val="17"/>
         </w:rPr>
-        <w:t xml:space="preserve">A family portrait.</w:t>
+        <w:t xml:space="preserve">RESISEI LAYLA  ·  SIMAN 27</w:t>
+      </w:r>
+    </w:p>
+    <w:p>
+      <w:pPr>
+        <w:pStyle w:val="Heading1"/>
+        <w:spacing w:before="0"/>
+      </w:pPr>
+      <w:r>
+        <w:rPr>
+          <w:rFonts w:ascii="Georgia" w:hAnsi="Georgia" w:eastAsia="Georgia" w:cs="Times New Roman"/>
+        </w:rPr>
+        <w:t xml:space="preserve">Not the Doer</w:t>
       </w:r>
     </w:p>
     <w:p>
@@ -762,46 +1291,19 @@
         <w:rPr>
           <w:rFonts w:ascii="Georgia" w:hAnsi="Georgia" w:eastAsia="Georgia" w:cs="Times New Roman"/>
         </w:rPr>
-        <w:t xml:space="preserve">I cannot tell you everything my mother felt in those five and a half years. I was a child, and children do not see all of it. But I can tell you what I saw her do with them. She did not treat the hard years as time to be endured until the real life resumed. She treated them as life. She lived inside the night and she did not stop giving, and that, I now understand, is what Rav Tzadok means by faith as an occupation.</w:t>
-      </w:r>
-    </w:p>
-    <w:p>
-      <w:r>
-        <w:rPr>
-          <w:rFonts w:ascii="Georgia" w:hAnsi="Georgia" w:eastAsia="Georgia" w:cs="Times New Roman"/>
-        </w:rPr>
-        <w:t xml:space="preserve">It is also what he did. A man whose first marriage did not work out, and whose home never had children, wrote many books on how the soul lives in this world, and none of them is a complaint. He was a person living by his faith, “even while his work was in darkness.”</w:t>
-      </w:r>
-    </w:p>
-    <w:p>
-      <w:pPr>
-        <w:pStyle w:val="Heading1"/>
-      </w:pPr>
-      <w:r>
-        <w:rPr>
-          <w:rFonts w:ascii="Georgia" w:hAnsi="Georgia" w:eastAsia="Georgia" w:cs="Times New Roman"/>
-        </w:rPr>
-        <w:t xml:space="preserve">Not the Doer: Siman 27</w:t>
-      </w:r>
-    </w:p>
-    <w:p>
-      <w:r>
-        <w:rPr>
-          <w:rFonts w:ascii="Georgia" w:hAnsi="Georgia" w:eastAsia="Georgia" w:cs="Times New Roman"/>
-        </w:rPr>
-        <w:t xml:space="preserve">Twenty-two simanim later, Rav Tzadok comes back to the same idea from a completely different direction. He is explaining why the Torah forbids work on Shabbos, and his answer is not what most of us expect.</w:t>
+        <w:t xml:space="preserve">Twenty-two simanim later, Rav Tzadok returns to the same idea from a completely different direction. He is explaining why the Torah forbids work on Shabbos, and his answer is not what most of us expect.</w:t>
       </w:r>
     </w:p>
     <w:p>
       <w:pPr>
         <w:keepNext/>
         <w:keepLines/>
-        <w:spacing w:before="120" w:after="0"/>
-        <w:ind w:left="504" w:right="288"/>
         <w:pBdr>
           <w:left w:val="single" w:sz="18" w:space="10" w:color="C9A66B"/>
         </w:pBdr>
         <w:shd w:val="clear" w:color="auto" w:fill="F6F1E7"/>
+        <w:spacing w:before="120" w:after="0"/>
+        <w:ind w:left="504" w:right="288"/>
       </w:pPr>
       <w:r>
         <w:rPr>
@@ -815,13 +1317,13 @@
     <w:p>
       <w:pPr>
         <w:keepNext/>
-        <w:bidi/>
-        <w:spacing w:before="0" w:after="0" w:line="312" w:lineRule="auto"/>
-        <w:ind w:left="288" w:right="504"/>
         <w:pBdr>
           <w:left w:val="single" w:sz="18" w:space="10" w:color="C9A66B"/>
         </w:pBdr>
         <w:shd w:val="clear" w:color="auto" w:fill="F6F1E7"/>
+        <w:bidi/>
+        <w:spacing w:before="0" w:after="0" w:line="312" w:lineRule="auto"/>
+        <w:ind w:left="288" w:right="504"/>
       </w:pPr>
       <w:r>
         <w:rPr>
@@ -838,12 +1340,12 @@
     </w:p>
     <w:p>
       <w:pPr>
-        <w:spacing w:before="0" w:after="240"/>
-        <w:ind w:left="504" w:right="288"/>
         <w:pBdr>
           <w:left w:val="single" w:sz="18" w:space="10" w:color="C9A66B"/>
         </w:pBdr>
         <w:shd w:val="clear" w:color="auto" w:fill="F6F1E7"/>
+        <w:spacing w:before="0" w:after="240"/>
+        <w:ind w:left="504" w:right="288"/>
       </w:pPr>
       <w:r>
         <w:rPr>
@@ -861,7 +1363,7 @@
         <w:rPr>
           <w:rFonts w:ascii="Georgia" w:hAnsi="Georgia" w:eastAsia="Georgia" w:cs="Times New Roman"/>
         </w:rPr>
-        <w:t xml:space="preserve">That is the reason for Shabbos. For six days a person works, plans, builds, and worries, and it is very easy to start believing that he is the one doing all of it. Then, on Shabbos, he stops. And in the stopping he testifies. The world did not fall apart when his hands rested, because his hands were never the source.</w:t>
+        <w:t xml:space="preserve">That is the reason for Shabbos. For six days a person works, plans, builds and worries, and it is very easy to believe that he is the one doing all of it. Then, on Shabbos, he stops, and in the stopping he testifies. The world did not fall apart when his hands rested, because his hands were never the source.</w:t>
       </w:r>
       <w:r>
         <w:rPr>
@@ -874,7 +1376,7 @@
         <w:rPr>
           <w:rFonts w:ascii="Georgia" w:hAnsi="Georgia" w:eastAsia="Georgia" w:cs="Times New Roman"/>
         </w:rPr>
-        <w:t xml:space="preserve"> Rav Tzadok reads even the verse’s phrasing this way: “six days </w:t>
+        <w:t xml:space="preserve"> Rav Tzadok even reads the phrasing of the verse this way: “six days </w:t>
       </w:r>
       <w:r>
         <w:rPr>
@@ -914,12 +1416,12 @@
       <w:pPr>
         <w:keepNext/>
         <w:keepLines/>
-        <w:spacing w:before="120" w:after="0"/>
-        <w:ind w:left="504" w:right="288"/>
         <w:pBdr>
           <w:left w:val="single" w:sz="18" w:space="10" w:color="C9A66B"/>
         </w:pBdr>
         <w:shd w:val="clear" w:color="auto" w:fill="F6F1E7"/>
+        <w:spacing w:before="120" w:after="0"/>
+        <w:ind w:left="504" w:right="288"/>
       </w:pPr>
       <w:r>
         <w:rPr>
@@ -933,13 +1435,13 @@
     <w:p>
       <w:pPr>
         <w:keepNext/>
-        <w:bidi/>
-        <w:spacing w:before="0" w:after="0" w:line="312" w:lineRule="auto"/>
-        <w:ind w:left="288" w:right="504"/>
         <w:pBdr>
           <w:left w:val="single" w:sz="18" w:space="10" w:color="C9A66B"/>
         </w:pBdr>
         <w:shd w:val="clear" w:color="auto" w:fill="F6F1E7"/>
+        <w:bidi/>
+        <w:spacing w:before="0" w:after="0" w:line="312" w:lineRule="auto"/>
+        <w:ind w:left="288" w:right="504"/>
       </w:pPr>
       <w:r>
         <w:rPr>
@@ -956,12 +1458,12 @@
     </w:p>
     <w:p>
       <w:pPr>
-        <w:spacing w:before="0" w:after="240"/>
-        <w:ind w:left="504" w:right="288"/>
         <w:pBdr>
           <w:left w:val="single" w:sz="18" w:space="10" w:color="C9A66B"/>
         </w:pBdr>
         <w:shd w:val="clear" w:color="auto" w:fill="F6F1E7"/>
+        <w:spacing w:before="0" w:after="240"/>
+        <w:ind w:left="504" w:right="288"/>
       </w:pPr>
       <w:r>
         <w:rPr>
@@ -979,20 +1481,7 @@
         <w:rPr>
           <w:rFonts w:ascii="Georgia" w:hAnsi="Georgia" w:eastAsia="Georgia" w:cs="Times New Roman"/>
         </w:rPr>
-        <w:t xml:space="preserve">And then he gives a conclusion that I find moving every time I read it. It is not only that Shabbos is permitted </w:t>
-      </w:r>
-      <w:r>
-        <w:rPr>
-          <w:rFonts w:ascii="Georgia" w:hAnsi="Georgia" w:eastAsia="Georgia" w:cs="Times New Roman"/>
-          <w:i/>
-        </w:rPr>
-        <w:t xml:space="preserve">despite</w:t>
-      </w:r>
-      <w:r>
-        <w:rPr>
-          <w:rFonts w:ascii="Georgia" w:hAnsi="Georgia" w:eastAsia="Georgia" w:cs="Times New Roman"/>
-        </w:rPr>
-        <w:t xml:space="preserve"> the work of the week. He says that the work of the six days is permitted only </w:t>
+        <w:t xml:space="preserve">And then comes a conclusion that moves me every time. It is not only that Shabbos is permitted despite the work of the week. The work of the six days is permitted only </w:t>
       </w:r>
       <w:r>
         <w:rPr>
@@ -1012,12 +1501,12 @@
       <w:pPr>
         <w:keepNext/>
         <w:keepLines/>
-        <w:spacing w:before="120" w:after="0"/>
-        <w:ind w:left="504" w:right="288"/>
         <w:pBdr>
           <w:left w:val="single" w:sz="18" w:space="10" w:color="C9A66B"/>
         </w:pBdr>
         <w:shd w:val="clear" w:color="auto" w:fill="F6F1E7"/>
+        <w:spacing w:before="120" w:after="0"/>
+        <w:ind w:left="504" w:right="288"/>
       </w:pPr>
       <w:r>
         <w:rPr>
@@ -1031,13 +1520,13 @@
     <w:p>
       <w:pPr>
         <w:keepNext/>
-        <w:bidi/>
-        <w:spacing w:before="0" w:after="0" w:line="312" w:lineRule="auto"/>
-        <w:ind w:left="288" w:right="504"/>
         <w:pBdr>
           <w:left w:val="single" w:sz="18" w:space="10" w:color="C9A66B"/>
         </w:pBdr>
         <w:shd w:val="clear" w:color="auto" w:fill="F6F1E7"/>
+        <w:bidi/>
+        <w:spacing w:before="0" w:after="0" w:line="312" w:lineRule="auto"/>
+        <w:ind w:left="288" w:right="504"/>
       </w:pPr>
       <w:r>
         <w:rPr>
@@ -1054,12 +1543,12 @@
     </w:p>
     <w:p>
       <w:pPr>
-        <w:spacing w:before="0" w:after="240"/>
-        <w:ind w:left="504" w:right="288"/>
         <w:pBdr>
           <w:left w:val="single" w:sz="18" w:space="10" w:color="C9A66B"/>
         </w:pBdr>
         <w:shd w:val="clear" w:color="auto" w:fill="F6F1E7"/>
+        <w:spacing w:before="0" w:after="240"/>
+        <w:ind w:left="504" w:right="288"/>
       </w:pPr>
       <w:r>
         <w:rPr>
@@ -1077,7 +1566,7 @@
         <w:rPr>
           <w:rFonts w:ascii="Georgia" w:hAnsi="Georgia" w:eastAsia="Georgia" w:cs="Times New Roman"/>
         </w:rPr>
-        <w:t xml:space="preserve">Think about what that means. We are allowed to labor, to strive, to give everything we have, as long as we know the truth underneath it. The effort is real. The effort is even commanded. But we are never the final cause.</w:t>
+        <w:t xml:space="preserve">Here is where Rav Tzadok and the Last Lecture meet, and also where they part. “We cannot change the cards we are dealt, just how we play the hand” is true, and it is a brave and wise way to say it. Rav Tzadok goes one step beyond. The cards are not random. They come from the One who is also the source of the strength to play them. We are told to labor, to strive, to give everything we have. The effort is real, and even commanded. But we are never the final cause, and that is not a burden but a freedom.</w:t>
       </w:r>
     </w:p>
     <w:tbl>
@@ -1108,7 +1597,7 @@
               <w:drawing>
                 <wp:inline xmlns:a="http://schemas.openxmlformats.org/drawingml/2006/main" xmlns:pic="http://schemas.openxmlformats.org/drawingml/2006/picture">
                   <wp:extent cx="2834640" cy="1889085"/>
-                  <wp:docPr id="3" name="Picture 3" descr="Photograph preserved from the source essay, or authentic Resisei Layla cover from the Akiva Publishing KDP cover PDF."/>
+                  <wp:docPr id="5" name="Picture 5"/>
                   <wp:cNvGraphicFramePr>
                     <a:graphicFrameLocks noChangeAspect="1"/>
                   </wp:cNvGraphicFramePr>
@@ -1120,7 +1609,7 @@
                           <pic:cNvPicPr/>
                         </pic:nvPicPr>
                         <pic:blipFill>
-                          <a:blip r:embed="rId11"/>
+                          <a:blip r:embed="rId13"/>
                           <a:stretch>
                             <a:fillRect/>
                           </a:stretch>
@@ -1170,7 +1659,7 @@
               <w:drawing>
                 <wp:inline xmlns:a="http://schemas.openxmlformats.org/drawingml/2006/main" xmlns:pic="http://schemas.openxmlformats.org/drawingml/2006/picture">
                   <wp:extent cx="2834640" cy="1889085"/>
-                  <wp:docPr id="4" name="Picture 4" descr="Photograph preserved from the source essay, or authentic Resisei Layla cover from the Akiva Publishing KDP cover PDF."/>
+                  <wp:docPr id="6" name="Picture 6"/>
                   <wp:cNvGraphicFramePr>
                     <a:graphicFrameLocks noChangeAspect="1"/>
                   </wp:cNvGraphicFramePr>
@@ -1182,7 +1671,7 @@
                           <pic:cNvPicPr/>
                         </pic:nvPicPr>
                         <pic:blipFill>
-                          <a:blip r:embed="rId12"/>
+                          <a:blip r:embed="rId14"/>
                           <a:stretch>
                             <a:fillRect/>
                           </a:stretch>
@@ -1230,20 +1719,7 @@
         <w:rPr>
           <w:rFonts w:ascii="Georgia" w:hAnsi="Georgia" w:eastAsia="Georgia" w:cs="Times New Roman"/>
         </w:rPr>
-        <w:t xml:space="preserve">Nothing strips away the illusion of control faster than a serious illness. My mother lived in that truth for five and a half years in a way most of us never have to. The people around her, the doctors, the family, we children, could all do a great deal, and none of us could do the one thing. I do not say this as a consolation. I say it because Rav Tzadok says it is simply </w:t>
-      </w:r>
-      <w:r>
-        <w:rPr>
-          <w:rFonts w:ascii="Georgia" w:hAnsi="Georgia" w:eastAsia="Georgia" w:cs="Times New Roman"/>
-          <w:i/>
-        </w:rPr>
-        <w:t xml:space="preserve">the truth</w:t>
-      </w:r>
-      <w:r>
-        <w:rPr>
-          <w:rFonts w:ascii="Georgia" w:hAnsi="Georgia" w:eastAsia="Georgia" w:cs="Times New Roman"/>
-        </w:rPr>
-        <w:t xml:space="preserve"> about every one of us, in good years as well. And I believe those who see it early are not the weaker for it. They are freer. They stop spending their strength on the question of control, and they can spend all of it on love.</w:t>
+        <w:t xml:space="preserve">Nothing strips away the illusion of control faster than a serious illness. My mother lived with that truth for years, at an age when most people have barely begun to face it. I do not say this as a consolation. I say it because Rav Tzadok says it is simply the truth about every one of us, in good years as well. And I believe the people who see it early are not weaker for it. They are freer. They stop spending their strength on the question of control, and they can spend all of it on love.</w:t>
       </w:r>
     </w:p>
     <w:p>
@@ -1251,18 +1727,37 @@
         <w:rPr>
           <w:rFonts w:ascii="Georgia" w:hAnsi="Georgia" w:eastAsia="Georgia" w:cs="Times New Roman"/>
         </w:rPr>
-        <w:t xml:space="preserve">Rav Tzadok knew it from his own life, too. Whether a marriage works and whether a home has children are exactly the things a person does not control. “For all our works You have wrought for us” was, I believe, not only a verse to him. It was how he understood his own story.</w:t>
+        <w:t xml:space="preserve">Rav Tzadok knew it from his own life. Whether a marriage lasts, whether a home has children, whether there is bread on the table: these are exactly the things a person does not control. “For all our works You have wrought for us” was not only a verse for him. I believe it was how he understood his own story.</w:t>
+      </w:r>
+    </w:p>
+    <w:p>
+      <w:pPr>
+        <w:keepNext/>
+        <w:spacing w:before="520" w:after="60"/>
+        <w:jc w:val="left"/>
+      </w:pPr>
+      <w:r>
+        <w:rPr>
+          <w:rFonts w:ascii="Georgia" w:hAnsi="Georgia" w:eastAsia="Georgia" w:cs="Times New Roman"/>
+          <w:b/>
+          <w:color w:val="5F666D"/>
+          <w:spacing w:val="40"/>
+          <w:sz w:val="17"/>
+          <w:szCs w:val="17"/>
+        </w:rPr>
+        <w:t xml:space="preserve">RESISEI LAYLA  ·  SIMAN 24</w:t>
       </w:r>
     </w:p>
     <w:p>
       <w:pPr>
         <w:pStyle w:val="Heading1"/>
+        <w:spacing w:before="0"/>
       </w:pPr>
       <w:r>
         <w:rPr>
           <w:rFonts w:ascii="Georgia" w:hAnsi="Georgia" w:eastAsia="Georgia" w:cs="Times New Roman"/>
         </w:rPr>
-        <w:t xml:space="preserve">The Joy That Is Given: Siman 21</w:t>
+        <w:t xml:space="preserve">Light Only Comes Out of Darkness</w:t>
       </w:r>
     </w:p>
     <w:p>
@@ -1270,7 +1765,181 @@
         <w:rPr>
           <w:rFonts w:ascii="Georgia" w:hAnsi="Georgia" w:eastAsia="Georgia" w:cs="Times New Roman"/>
         </w:rPr>
-        <w:t xml:space="preserve">If everything comes from Hashem, then there is one more thing that comes from Him which we usually take to be entirely our own. In Siman 21 Rav Tzadok lists the gifts that Heaven gives a person, and the list begins like this: wisdom in the mind, </w:t>
+        <w:t xml:space="preserve">The hardest question, and the one I will not hide from, is about the night itself. Why does it have to be there? In Siman 24 Rav Tzadok offers an answer, drawn from the way the world was made. The Talmud says that in Creation, first there was darkness and then light.</w:t>
+      </w:r>
+      <w:r>
+        <w:rPr>
+          <w:rFonts w:ascii="Georgia" w:hAnsi="Georgia" w:eastAsia="Georgia" w:cs="Times New Roman"/>
+          <w:vertAlign w:val="superscript"/>
+        </w:rPr>
+        <w:footnoteReference w:id="7"/>
+      </w:r>
+      <w:r>
+        <w:rPr>
+          <w:rFonts w:ascii="Georgia" w:hAnsi="Georgia" w:eastAsia="Georgia" w:cs="Times New Roman"/>
+        </w:rPr>
+        <w:t xml:space="preserve"> He takes this as a law of all of life.</w:t>
+      </w:r>
+    </w:p>
+    <w:p>
+      <w:pPr>
+        <w:keepNext/>
+        <w:keepLines/>
+        <w:pBdr>
+          <w:left w:val="single" w:sz="18" w:space="10" w:color="C9A66B"/>
+        </w:pBdr>
+        <w:shd w:val="clear" w:color="auto" w:fill="F6F1E7"/>
+        <w:spacing w:before="120" w:after="0"/>
+        <w:ind w:left="504" w:right="288"/>
+      </w:pPr>
+      <w:r>
+        <w:rPr>
+          <w:rFonts w:ascii="Georgia" w:hAnsi="Georgia" w:eastAsia="Georgia" w:cs="Times New Roman"/>
+          <w:sz w:val="22"/>
+          <w:szCs w:val="22"/>
+        </w:rPr>
+        <w:t xml:space="preserve">“So it is throughout all the days of the world: you have no light revealed except out of the darkness that preceded it.”</w:t>
+      </w:r>
+    </w:p>
+    <w:p>
+      <w:pPr>
+        <w:keepNext/>
+        <w:pBdr>
+          <w:left w:val="single" w:sz="18" w:space="10" w:color="C9A66B"/>
+        </w:pBdr>
+        <w:shd w:val="clear" w:color="auto" w:fill="F6F1E7"/>
+        <w:bidi/>
+        <w:spacing w:before="0" w:after="0" w:line="312" w:lineRule="auto"/>
+        <w:ind w:left="288" w:right="504"/>
+      </w:pPr>
+      <w:r>
+        <w:rPr>
+          <w:rFonts w:ascii="Georgia" w:hAnsi="Georgia" w:eastAsia="Georgia" w:cs="Times New Roman"/>
+          <w:b/>
+          <w:bCs/>
+          <w:color w:val="222B33"/>
+          <w:sz w:val="24"/>
+          <w:szCs w:val="27"/>
+          <w:rtl/>
+        </w:rPr>
+        <w:t xml:space="preserve">כָּךְ הוּא בְּכָל יְמוֹת עוֹלָם … אֵין לְךָ שׁוּם אוֹר מִתְגַּלֶּה אֶלָּא מִתּוֹךְ הַחֹשֶׁךְ הַקָּדוּם לוֹ</w:t>
+      </w:r>
+    </w:p>
+    <w:p>
+      <w:pPr>
+        <w:pBdr>
+          <w:left w:val="single" w:sz="18" w:space="10" w:color="C9A66B"/>
+        </w:pBdr>
+        <w:shd w:val="clear" w:color="auto" w:fill="F6F1E7"/>
+        <w:spacing w:before="0" w:after="240"/>
+        <w:ind w:left="504" w:right="288"/>
+      </w:pPr>
+      <w:r>
+        <w:rPr>
+          <w:rFonts w:ascii="Georgia" w:hAnsi="Georgia" w:eastAsia="Georgia" w:cs="Times New Roman"/>
+          <w:b/>
+          <w:color w:val="8A5A1F"/>
+          <w:sz w:val="19"/>
+          <w:szCs w:val="19"/>
+        </w:rPr>
+        <w:t xml:space="preserve">— Resisei Layla, Siman 24, Seif 1</w:t>
+      </w:r>
+    </w:p>
+    <w:p>
+      <w:r>
+        <w:drawing>
+          <wp:anchor distT="0" distB="91440" distL="182880" distR="0" simplePos="0" relativeHeight="251658741" behindDoc="0" locked="0" layoutInCell="1" allowOverlap="0">
+            <wp:simplePos x="0" y="0"/>
+            <wp:positionH relativeFrom="margin">
+              <wp:align>right</wp:align>
+            </wp:positionH>
+            <wp:positionV relativeFrom="paragraph">
+              <wp:posOffset>45720</wp:posOffset>
+            </wp:positionV>
+            <wp:extent cx="2743200" cy="2045208"/>
+            <wp:effectExtent l="0" t="0" r="0" b="0"/>
+            <wp:wrapSquare wrapText="bothSides"/>
+            <wp:docPr id="7" name="Picture 7"/>
+            <wp:cNvGraphicFramePr xmlns:a="http://schemas.openxmlformats.org/drawingml/2006/main">
+              <a:graphicFrameLocks noChangeAspect="1"/>
+            </wp:cNvGraphicFramePr>
+            <a:graphic xmlns:a="http://schemas.openxmlformats.org/drawingml/2006/main" xmlns:pic="http://schemas.openxmlformats.org/drawingml/2006/picture">
+              <a:graphicData uri="http://schemas.openxmlformats.org/drawingml/2006/picture">
+                <pic:pic>
+                  <pic:nvPicPr>
+                    <pic:cNvPr id="0" name="_cap_hike.jpg"/>
+                    <pic:cNvPicPr/>
+                  </pic:nvPicPr>
+                  <pic:blipFill>
+                    <a:blip r:embed="rId15"/>
+                    <a:stretch>
+                      <a:fillRect/>
+                    </a:stretch>
+                  </pic:blipFill>
+                  <pic:spPr>
+                    <a:xfrm>
+                      <a:off x="0" y="0"/>
+                      <a:ext cx="2743200" cy="2045208"/>
+                    </a:xfrm>
+                    <a:prstGeom prst="rect"/>
+                  </pic:spPr>
+                </pic:pic>
+              </a:graphicData>
+            </a:graphic>
+          </wp:anchor>
+        </w:drawing>
+      </w:r>
+      <w:r>
+        <w:rPr>
+          <w:rFonts w:ascii="Georgia" w:hAnsi="Georgia" w:eastAsia="Georgia" w:cs="Times New Roman"/>
+        </w:rPr>
+        <w:t xml:space="preserve">His examples come from the history of our people: the Torah was given only after the Exodus, and the Exodus came only after Israel had sunk to the depths of Egypt. I want to be careful here. Rav Tzadok is not saying that suffering is good, and I would never say it to anyone in pain. He is saying that darkness is not the end of the story, and that a person who is in it need not conclude that his life has lost its meaning. Pausch called it a brick wall. Rav Tzadok calls it the place from which the light will come.</w:t>
+      </w:r>
+    </w:p>
+    <w:p>
+      <w:r>
+        <w:rPr>
+          <w:rFonts w:ascii="Georgia" w:hAnsi="Georgia" w:eastAsia="Georgia" w:cs="Times New Roman"/>
+        </w:rPr>
+        <w:t xml:space="preserve">That is what I watched my mother do. Overcoming hardship did not mean that the hardship went away. It meant refusing to let it end her service of Hashem, and refusing to let it end her giving.</w:t>
+      </w:r>
+    </w:p>
+    <w:p>
+      <w:pPr>
+        <w:keepNext/>
+        <w:spacing w:before="520" w:after="60"/>
+        <w:jc w:val="left"/>
+      </w:pPr>
+      <w:r>
+        <w:rPr>
+          <w:rFonts w:ascii="Georgia" w:hAnsi="Georgia" w:eastAsia="Georgia" w:cs="Times New Roman"/>
+          <w:b/>
+          <w:color w:val="5F666D"/>
+          <w:spacing w:val="40"/>
+          <w:sz w:val="17"/>
+          <w:szCs w:val="17"/>
+        </w:rPr>
+        <w:t xml:space="preserve">RESISEI LAYLA  ·  SIMAN 21</w:t>
+      </w:r>
+    </w:p>
+    <w:p>
+      <w:pPr>
+        <w:pStyle w:val="Heading1"/>
+        <w:spacing w:before="0"/>
+      </w:pPr>
+      <w:r>
+        <w:rPr>
+          <w:rFonts w:ascii="Georgia" w:hAnsi="Georgia" w:eastAsia="Georgia" w:cs="Times New Roman"/>
+        </w:rPr>
+        <w:t xml:space="preserve">The Joy That Is Given</w:t>
+      </w:r>
+    </w:p>
+    <w:p>
+      <w:r>
+        <w:rPr>
+          <w:rFonts w:ascii="Georgia" w:hAnsi="Georgia" w:eastAsia="Georgia" w:cs="Times New Roman"/>
+        </w:rPr>
+        <w:t xml:space="preserve">If everything comes from Hashem, then so does something we usually think of as entirely our own. In Siman 21 Rav Tzadok lists the gifts that Heaven gives a person, and the list begins like this: wisdom in the mind, </w:t>
       </w:r>
       <w:r>
         <w:rPr>
@@ -1290,7 +1959,7 @@
           <w:rFonts w:ascii="Georgia" w:hAnsi="Georgia" w:eastAsia="Georgia" w:cs="Times New Roman"/>
           <w:vertAlign w:val="superscript"/>
         </w:rPr>
-        <w:footnoteReference w:id="7"/>
+        <w:footnoteReference w:id="8"/>
       </w:r>
     </w:p>
     <w:p>
@@ -1305,12 +1974,12 @@
       <w:pPr>
         <w:keepNext/>
         <w:keepLines/>
-        <w:spacing w:before="120" w:after="0"/>
-        <w:ind w:left="504" w:right="288"/>
         <w:pBdr>
           <w:left w:val="single" w:sz="18" w:space="10" w:color="C9A66B"/>
         </w:pBdr>
         <w:shd w:val="clear" w:color="auto" w:fill="F6F1E7"/>
+        <w:spacing w:before="120" w:after="0"/>
+        <w:ind w:left="504" w:right="288"/>
       </w:pPr>
       <w:r>
         <w:rPr>
@@ -1324,13 +1993,13 @@
     <w:p>
       <w:pPr>
         <w:keepNext/>
-        <w:bidi/>
-        <w:spacing w:before="0" w:after="0" w:line="312" w:lineRule="auto"/>
-        <w:ind w:left="288" w:right="504"/>
         <w:pBdr>
           <w:left w:val="single" w:sz="18" w:space="10" w:color="C9A66B"/>
         </w:pBdr>
         <w:shd w:val="clear" w:color="auto" w:fill="F6F1E7"/>
+        <w:bidi/>
+        <w:spacing w:before="0" w:after="0" w:line="312" w:lineRule="auto"/>
+        <w:ind w:left="288" w:right="504"/>
       </w:pPr>
       <w:r>
         <w:rPr>
@@ -1347,12 +2016,12 @@
     </w:p>
     <w:p>
       <w:pPr>
-        <w:spacing w:before="0" w:after="240"/>
-        <w:ind w:left="504" w:right="288"/>
         <w:pBdr>
           <w:left w:val="single" w:sz="18" w:space="10" w:color="C9A66B"/>
         </w:pBdr>
         <w:shd w:val="clear" w:color="auto" w:fill="F6F1E7"/>
+        <w:spacing w:before="0" w:after="240"/>
+        <w:ind w:left="504" w:right="288"/>
       </w:pPr>
       <w:r>
         <w:rPr>
@@ -1377,7 +2046,7 @@
           <w:rFonts w:ascii="Georgia" w:hAnsi="Georgia" w:eastAsia="Georgia" w:cs="Times New Roman"/>
           <w:vertAlign w:val="superscript"/>
         </w:rPr>
-        <w:footnoteReference w:id="8"/>
+        <w:footnoteReference w:id="9"/>
       </w:r>
       <w:r>
         <w:rPr>
@@ -1388,10 +2057,53 @@
     </w:p>
     <w:p>
       <w:r>
+        <w:drawing>
+          <wp:anchor distT="0" distB="91440" distL="0" distR="182880" simplePos="0" relativeHeight="251658742" behindDoc="0" locked="0" layoutInCell="1" allowOverlap="0">
+            <wp:simplePos x="0" y="0"/>
+            <wp:positionH relativeFrom="margin">
+              <wp:align>left</wp:align>
+            </wp:positionH>
+            <wp:positionV relativeFrom="paragraph">
+              <wp:posOffset>45720</wp:posOffset>
+            </wp:positionV>
+            <wp:extent cx="2560320" cy="2188464"/>
+            <wp:effectExtent l="0" t="0" r="0" b="0"/>
+            <wp:wrapSquare wrapText="bothSides"/>
+            <wp:docPr id="8" name="Picture 8"/>
+            <wp:cNvGraphicFramePr xmlns:a="http://schemas.openxmlformats.org/drawingml/2006/main">
+              <a:graphicFrameLocks noChangeAspect="1"/>
+            </wp:cNvGraphicFramePr>
+            <a:graphic xmlns:a="http://schemas.openxmlformats.org/drawingml/2006/main" xmlns:pic="http://schemas.openxmlformats.org/drawingml/2006/picture">
+              <a:graphicData uri="http://schemas.openxmlformats.org/drawingml/2006/picture">
+                <pic:pic>
+                  <pic:nvPicPr>
+                    <pic:cNvPr id="0" name="_cap_dance.jpg"/>
+                    <pic:cNvPicPr/>
+                  </pic:nvPicPr>
+                  <pic:blipFill>
+                    <a:blip r:embed="rId16"/>
+                    <a:stretch>
+                      <a:fillRect/>
+                    </a:stretch>
+                  </pic:blipFill>
+                  <pic:spPr>
+                    <a:xfrm>
+                      <a:off x="0" y="0"/>
+                      <a:ext cx="2560320" cy="2188464"/>
+                    </a:xfrm>
+                    <a:prstGeom prst="rect"/>
+                  </pic:spPr>
+                </pic:pic>
+              </a:graphicData>
+            </a:graphic>
+          </wp:anchor>
+        </w:drawing>
+      </w:r>
+      <w:r>
         <w:rPr>
           <w:rFonts w:ascii="Georgia" w:hAnsi="Georgia" w:eastAsia="Georgia" w:cs="Times New Roman"/>
         </w:rPr>
-        <w:t xml:space="preserve">I think this is the part of Rav Tzadok’s life that I find hardest to understand and most worth trying to. A man with his circumstances should, by any ordinary accounting, have been poor. Everything I have learned of him suggests the opposite: a person who lived with real </w:t>
+        <w:t xml:space="preserve">By any ordinary accounting, Rav Tzadok should have been poor, and in the plainest sense of the word he was. Yet everything I have learned about him suggests a person who lived with real </w:t>
       </w:r>
       <w:r>
         <w:rPr>
@@ -1404,64 +2116,7 @@
         <w:rPr>
           <w:rFonts w:ascii="Georgia" w:hAnsi="Georgia" w:eastAsia="Georgia" w:cs="Times New Roman"/>
         </w:rPr>
-        <w:t xml:space="preserve">, because he knew from where everything comes. He was not rich in what he had. He was rich in how he held it.</w:t>
-      </w:r>
-    </w:p>
-    <w:p>
-      <w:pPr>
-        <w:keepNext/>
-        <w:spacing w:before="160" w:after="40"/>
-        <w:jc w:val="center"/>
-      </w:pPr>
-      <w:r>
-        <w:drawing>
-          <wp:inline xmlns:a="http://schemas.openxmlformats.org/drawingml/2006/main" xmlns:pic="http://schemas.openxmlformats.org/drawingml/2006/picture">
-            <wp:extent cx="3840480" cy="2954215"/>
-            <wp:docPr id="5" name="Picture 5" descr="Photograph preserved from the source essay, or authentic Resisei Layla cover from the Akiva Publishing KDP cover PDF."/>
-            <wp:cNvGraphicFramePr>
-              <a:graphicFrameLocks noChangeAspect="1"/>
-            </wp:cNvGraphicFramePr>
-            <a:graphic>
-              <a:graphicData uri="http://schemas.openxmlformats.org/drawingml/2006/picture">
-                <pic:pic>
-                  <pic:nvPicPr>
-                    <pic:cNvPr id="0" name="dance.jpg"/>
-                    <pic:cNvPicPr/>
-                  </pic:nvPicPr>
-                  <pic:blipFill>
-                    <a:blip r:embed="rId13"/>
-                    <a:stretch>
-                      <a:fillRect/>
-                    </a:stretch>
-                  </pic:blipFill>
-                  <pic:spPr>
-                    <a:xfrm>
-                      <a:off x="0" y="0"/>
-                      <a:ext cx="3840480" cy="2954215"/>
-                    </a:xfrm>
-                    <a:prstGeom prst="rect"/>
-                  </pic:spPr>
-                </pic:pic>
-              </a:graphicData>
-            </a:graphic>
-          </wp:inline>
-        </w:drawing>
-      </w:r>
-    </w:p>
-    <w:p>
-      <w:pPr>
-        <w:spacing w:after="240"/>
-        <w:jc w:val="center"/>
-      </w:pPr>
-      <w:r>
-        <w:rPr>
-          <w:rFonts w:ascii="Georgia" w:hAnsi="Georgia" w:eastAsia="Georgia" w:cs="Times New Roman"/>
-          <w:i/>
-          <w:color w:val="5F666D"/>
-          <w:sz w:val="19"/>
-          <w:szCs w:val="19"/>
-        </w:rPr>
-        <w:t xml:space="preserve">At a simchah.</w:t>
+        <w:t xml:space="preserve">, because he knew where everything comes from. He was not rich in what he had. He was rich in how he held it.</w:t>
       </w:r>
     </w:p>
     <w:p>
@@ -1469,204 +2124,14 @@
         <w:rPr>
           <w:rFonts w:ascii="Georgia" w:hAnsi="Georgia" w:eastAsia="Georgia" w:cs="Times New Roman"/>
         </w:rPr>
-        <w:t xml:space="preserve">When I look through the photographs from those years, I am struck by how often she is smiling. Not because there was nothing to be afraid of. She was a woman who gave her whole heart to everything she did, and that included joy. She made sure that we had a childhood with warmth in it, even while she was living in the night that Rav Tzadok describes.</w:t>
-      </w:r>
-    </w:p>
-    <w:p>
-      <w:r>
-        <w:rPr>
-          <w:rFonts w:ascii="Georgia" w:hAnsi="Georgia" w:eastAsia="Georgia" w:cs="Times New Roman"/>
-        </w:rPr>
-        <w:t xml:space="preserve">That, too, is a form of faith. Gladness in the heart, in the middle of the dark, is a way of saying </w:t>
+        <w:t xml:space="preserve">My mother was like that. She was not a woman who had a great deal of ease. She had been giving herself away since she was a girl of fourteen. And yet when I look through the photographs from those years, I am struck by how often she is smiling. She made sure that we had a childhood with warmth in it, even while she was living in the night that Rav Tzadok describes. Gladness in the heart, in the middle of the dark, is a way of saying: </w:t>
       </w:r>
       <w:r>
         <w:rPr>
           <w:rFonts w:ascii="Georgia" w:hAnsi="Georgia" w:eastAsia="Georgia" w:cs="Times New Roman"/>
           <w:i/>
         </w:rPr>
-        <w:t xml:space="preserve">I know whose world this is</w:t>
-      </w:r>
-      <w:r>
-        <w:rPr>
-          <w:rFonts w:ascii="Georgia" w:hAnsi="Georgia" w:eastAsia="Georgia" w:cs="Times New Roman"/>
-        </w:rPr>
-        <w:t xml:space="preserve">.</w:t>
-      </w:r>
-    </w:p>
-    <w:p>
-      <w:pPr>
-        <w:pStyle w:val="Heading1"/>
-      </w:pPr>
-      <w:r>
-        <w:rPr>
-          <w:rFonts w:ascii="Georgia" w:hAnsi="Georgia" w:eastAsia="Georgia" w:cs="Times New Roman"/>
-        </w:rPr>
-        <w:t xml:space="preserve">A Real, Eternal Life</w:t>
-      </w:r>
-    </w:p>
-    <w:p>
-      <w:r>
-        <w:rPr>
-          <w:rFonts w:ascii="Georgia" w:hAnsi="Georgia" w:eastAsia="Georgia" w:cs="Times New Roman"/>
-        </w:rPr>
-        <w:t xml:space="preserve">Rav Tzadok devoted his writing to one question: how does a person live a life that does not end when the breath ends? His answer, as I read him, is that it begins with the bigger picture. The toil of this world is real, and it is the preparation. The Sages say it in one image: “One who toiled on the eve of Shabbos will eat on Shabbos.”</w:t>
-      </w:r>
-      <w:r>
-        <w:rPr>
-          <w:rFonts w:ascii="Georgia" w:hAnsi="Georgia" w:eastAsia="Georgia" w:cs="Times New Roman"/>
-          <w:vertAlign w:val="superscript"/>
-        </w:rPr>
-        <w:footnoteReference w:id="9"/>
-      </w:r>
-      <w:r>
-        <w:rPr>
-          <w:rFonts w:ascii="Georgia" w:hAnsi="Georgia" w:eastAsia="Georgia" w:cs="Times New Roman"/>
-        </w:rPr>
-        <w:t xml:space="preserve"> This world is the eve of Shabbos. What we put into it, in effort and love and faith, is what we bring to the table.</w:t>
-      </w:r>
-    </w:p>
-    <w:p>
-      <w:r>
-        <w:rPr>
-          <w:rFonts w:ascii="Georgia" w:hAnsi="Georgia" w:eastAsia="Georgia" w:cs="Times New Roman"/>
-        </w:rPr>
-        <w:t xml:space="preserve">I want to be careful about one thing. There is a passage in Siman 13 that I have thought about often in connection with hardship, and I do not want to stretch it beyond what Rav Tzadok means. There he says that the size of a person’s inner struggle is matched by the size of what he is capable of becoming.</w:t>
-      </w:r>
-    </w:p>
-    <w:p>
-      <w:pPr>
-        <w:keepNext/>
-        <w:keepLines/>
-        <w:spacing w:before="120" w:after="0"/>
-        <w:ind w:left="504" w:right="288"/>
-        <w:pBdr>
-          <w:left w:val="single" w:sz="18" w:space="10" w:color="C9A66B"/>
-        </w:pBdr>
-        <w:shd w:val="clear" w:color="auto" w:fill="F6F1E7"/>
-      </w:pPr>
-      <w:r>
-        <w:rPr>
-          <w:rFonts w:ascii="Georgia" w:hAnsi="Georgia" w:eastAsia="Georgia" w:cs="Times New Roman"/>
-          <w:sz w:val="22"/>
-          <w:szCs w:val="22"/>
-        </w:rPr>
-        <w:t xml:space="preserve">“Whoever has an immense deficiency is also a vessel for extraordinary perfection, if he merits.”</w:t>
-      </w:r>
-    </w:p>
-    <w:p>
-      <w:pPr>
-        <w:keepNext/>
-        <w:bidi/>
-        <w:spacing w:before="0" w:after="0" w:line="312" w:lineRule="auto"/>
-        <w:ind w:left="288" w:right="504"/>
-        <w:pBdr>
-          <w:left w:val="single" w:sz="18" w:space="10" w:color="C9A66B"/>
-        </w:pBdr>
-        <w:shd w:val="clear" w:color="auto" w:fill="F6F1E7"/>
-      </w:pPr>
-      <w:r>
-        <w:rPr>
-          <w:rFonts w:ascii="Georgia" w:hAnsi="Georgia" w:eastAsia="Georgia" w:cs="Times New Roman"/>
-          <w:b/>
-          <w:bCs/>
-          <w:color w:val="222B33"/>
-          <w:sz w:val="24"/>
-          <w:szCs w:val="27"/>
-          <w:rtl/>
-        </w:rPr>
-        <w:t xml:space="preserve">וְכָל שֶׁיֵּשׁ בּוֹ חִסָּרוֹן עָצוּם … הוּא כְּלִי גַּם כֵּן לִשְׁלֵימוּת מֻפְלָג אִם יִזְכֶּה</w:t>
-      </w:r>
-    </w:p>
-    <w:p>
-      <w:pPr>
-        <w:spacing w:before="0" w:after="240"/>
-        <w:ind w:left="504" w:right="288"/>
-        <w:pBdr>
-          <w:left w:val="single" w:sz="18" w:space="10" w:color="C9A66B"/>
-        </w:pBdr>
-        <w:shd w:val="clear" w:color="auto" w:fill="F6F1E7"/>
-      </w:pPr>
-      <w:r>
-        <w:rPr>
-          <w:rFonts w:ascii="Georgia" w:hAnsi="Georgia" w:eastAsia="Georgia" w:cs="Times New Roman"/>
-          <w:b/>
-          <w:color w:val="8A5A1F"/>
-          <w:sz w:val="19"/>
-          <w:szCs w:val="19"/>
-        </w:rPr>
-        <w:t xml:space="preserve">— Resisei Layla, Siman 13, Seif 1</w:t>
-      </w:r>
-      <w:r>
-        <w:rPr>
-          <w:rFonts w:ascii="Georgia" w:hAnsi="Georgia" w:eastAsia="Georgia" w:cs="Times New Roman"/>
-          <w:vertAlign w:val="superscript"/>
-        </w:rPr>
-        <w:footnoteReference w:id="10"/>
-      </w:r>
-    </w:p>
-    <w:p>
-      <w:r>
-        <w:rPr>
-          <w:rFonts w:ascii="Georgia" w:hAnsi="Georgia" w:eastAsia="Georgia" w:cs="Times New Roman"/>
-        </w:rPr>
-        <w:t xml:space="preserve">Rav Tzadok is speaking there of the inner struggle with desire and the drives of the soul, not of illness or loss. I would never tell anyone that suffering is a gift. But I do take from the passage something true about the shape of a life: the places where we are most tested are very often the places where we are given the most to build. In my mother’s case I saw it in the plainest terms. The more she was asked to carry, the more fully she gave.</w:t>
-      </w:r>
-    </w:p>
-    <w:p>
-      <w:pPr>
-        <w:keepNext/>
-        <w:spacing w:before="160" w:after="40"/>
-        <w:jc w:val="center"/>
-      </w:pPr>
-      <w:r>
-        <w:drawing>
-          <wp:inline xmlns:a="http://schemas.openxmlformats.org/drawingml/2006/main" xmlns:pic="http://schemas.openxmlformats.org/drawingml/2006/picture">
-            <wp:extent cx="4023360" cy="2681282"/>
-            <wp:docPr id="6" name="Picture 6" descr="Photograph preserved from the source essay, or authentic Resisei Layla cover from the Akiva Publishing KDP cover PDF."/>
-            <wp:cNvGraphicFramePr>
-              <a:graphicFrameLocks noChangeAspect="1"/>
-            </wp:cNvGraphicFramePr>
-            <a:graphic>
-              <a:graphicData uri="http://schemas.openxmlformats.org/drawingml/2006/picture">
-                <pic:pic>
-                  <pic:nvPicPr>
-                    <pic:cNvPr id="0" name="hike.jpg"/>
-                    <pic:cNvPicPr/>
-                  </pic:nvPicPr>
-                  <pic:blipFill>
-                    <a:blip r:embed="rId14"/>
-                    <a:stretch>
-                      <a:fillRect/>
-                    </a:stretch>
-                  </pic:blipFill>
-                  <pic:spPr>
-                    <a:xfrm>
-                      <a:off x="0" y="0"/>
-                      <a:ext cx="4023360" cy="2681282"/>
-                    </a:xfrm>
-                    <a:prstGeom prst="rect"/>
-                  </pic:spPr>
-                </pic:pic>
-              </a:graphicData>
-            </a:graphic>
-          </wp:inline>
-        </w:drawing>
-      </w:r>
-    </w:p>
-    <w:p>
-      <w:pPr>
-        <w:spacing w:after="240"/>
-        <w:jc w:val="center"/>
-      </w:pPr>
-      <w:r>
-        <w:rPr>
-          <w:rFonts w:ascii="Georgia" w:hAnsi="Georgia" w:eastAsia="Georgia" w:cs="Times New Roman"/>
-          <w:i/>
-          <w:color w:val="5F666D"/>
-          <w:sz w:val="19"/>
-          <w:szCs w:val="19"/>
-        </w:rPr>
-        <w:t xml:space="preserve">A family trip.</w:t>
+        <w:t xml:space="preserve">I know whose world this is.</w:t>
       </w:r>
     </w:p>
     <w:p>
@@ -1685,14 +2150,22 @@
         <w:rPr>
           <w:rFonts w:ascii="Georgia" w:hAnsi="Georgia" w:eastAsia="Georgia" w:cs="Times New Roman"/>
         </w:rPr>
-        <w:t xml:space="preserve">Rav Tzadok had no children of his own. Yet today, well over a century after his passing, his books are open on tables in yeshivos and homes around the world, and Jews are learning how to live from them. The Sages teach that “the main offspring of the righteous are their good deeds.”</w:t>
+        <w:t xml:space="preserve">Now I can try to answer the question the Last Lecture left me with. What do you hand a child who will have to live without you? Not advice, and not an explanation. You hand them a way of seeing: that time is precious, that a person can give every fiber of himself to what matters, and that behind all of it Someone is giving us everything we have, including the strength to go on.</w:t>
+      </w:r>
+    </w:p>
+    <w:p>
+      <w:r>
+        <w:rPr>
+          <w:rFonts w:ascii="Georgia" w:hAnsi="Georgia" w:eastAsia="Georgia" w:cs="Times New Roman"/>
+        </w:rPr>
+        <w:t xml:space="preserve">Rav Tzadok had no children of his own. Yet today, well over a century after his passing, his books are open on tables in yeshivos and homes around the world, and Jews are learning from them how to live. The Sages teach that “the main offspring of the righteous are their good deeds.”</w:t>
       </w:r>
       <w:r>
         <w:rPr>
           <w:rFonts w:ascii="Georgia" w:hAnsi="Georgia" w:eastAsia="Georgia" w:cs="Times New Roman"/>
           <w:vertAlign w:val="superscript"/>
         </w:rPr>
-        <w:footnoteReference w:id="11"/>
+        <w:footnoteReference w:id="10"/>
       </w:r>
       <w:r>
         <w:rPr>
@@ -1711,23 +2184,58 @@
         <w:rPr>
           <w:rFonts w:ascii="Georgia" w:hAnsi="Georgia" w:eastAsia="Georgia" w:cs="Times New Roman"/>
         </w:rPr>
-        <w:t xml:space="preserve"> were his children, and they are very much alive.</w:t>
+        <w:t xml:space="preserve"> became his children, and they are alive. The child who lost his father at six became, through his books, a father to generations.</w:t>
       </w:r>
     </w:p>
     <w:p>
       <w:r>
-        <w:rPr>
-          <w:rFonts w:ascii="Georgia" w:hAnsi="Georgia" w:eastAsia="Georgia" w:cs="Times New Roman"/>
-        </w:rPr>
-        <w:t xml:space="preserve">My mother also left a legacy that cannot be measured by a headstone. She left us the way she saw the world: that time is precious, that every fiber of a person can be given to what matters, and that behind all of it, Someone is giving us everything we have. She poured her life into setting us up for exactly that connection.</w:t>
+        <w:drawing>
+          <wp:anchor distT="0" distB="91440" distL="182880" distR="0" simplePos="0" relativeHeight="251658743" behindDoc="0" locked="0" layoutInCell="1" allowOverlap="0">
+            <wp:simplePos x="0" y="0"/>
+            <wp:positionH relativeFrom="margin">
+              <wp:align>right</wp:align>
+            </wp:positionH>
+            <wp:positionV relativeFrom="paragraph">
+              <wp:posOffset>45720</wp:posOffset>
+            </wp:positionV>
+            <wp:extent cx="2468880" cy="1862328"/>
+            <wp:effectExtent l="0" t="0" r="0" b="0"/>
+            <wp:wrapSquare wrapText="bothSides"/>
+            <wp:docPr id="9" name="Picture 9"/>
+            <wp:cNvGraphicFramePr xmlns:a="http://schemas.openxmlformats.org/drawingml/2006/main">
+              <a:graphicFrameLocks noChangeAspect="1"/>
+            </wp:cNvGraphicFramePr>
+            <a:graphic xmlns:a="http://schemas.openxmlformats.org/drawingml/2006/main" xmlns:pic="http://schemas.openxmlformats.org/drawingml/2006/picture">
+              <a:graphicData uri="http://schemas.openxmlformats.org/drawingml/2006/picture">
+                <pic:pic>
+                  <pic:nvPicPr>
+                    <pic:cNvPr id="0" name="_cap_sons.jpg"/>
+                    <pic:cNvPicPr/>
+                  </pic:nvPicPr>
+                  <pic:blipFill>
+                    <a:blip r:embed="rId17"/>
+                    <a:stretch>
+                      <a:fillRect/>
+                    </a:stretch>
+                  </pic:blipFill>
+                  <pic:spPr>
+                    <a:xfrm>
+                      <a:off x="0" y="0"/>
+                      <a:ext cx="2468880" cy="1862328"/>
+                    </a:xfrm>
+                    <a:prstGeom prst="rect"/>
+                  </pic:spPr>
+                </pic:pic>
+              </a:graphicData>
+            </a:graphic>
+          </wp:anchor>
+        </w:drawing>
       </w:r>
-    </w:p>
-    <w:p>
       <w:r>
         <w:rPr>
           <w:rFonts w:ascii="Georgia" w:hAnsi="Georgia" w:eastAsia="Georgia" w:cs="Times New Roman"/>
         </w:rPr>
-        <w:t xml:space="preserve">I am fifty now, and I still try to hand that on. I run a small publishing house, and I have been translating and annotating </w:t>
+        <w:t xml:space="preserve">Pausch left his children a recorded lecture and a book. My mother left no lecture and no book. She left children who grew up held by her, and a smile I am still unpacking. I am fifty now, and I am still trying to hand it on. Through my small publishing house I have been translating and annotating </w:t>
       </w:r>
       <w:r>
         <w:rPr>
@@ -1740,7 +2248,7 @@
         <w:rPr>
           <w:rFonts w:ascii="Georgia" w:hAnsi="Georgia" w:eastAsia="Georgia" w:cs="Times New Roman"/>
         </w:rPr>
-        <w:t xml:space="preserve"> so that more people can learn what Rav Tzadok says. It is, in a real way, a continuation of what my mother started in me when I was a boy. Every page of it is, I hope, a good deed in her merit.</w:t>
+        <w:t xml:space="preserve">, so that more people can learn what Rav Tzadok teaches. In a real way, it continues what my mother began in me when I was a boy, and I hope every page of it is a good deed in her merit.</w:t>
       </w:r>
     </w:p>
     <w:p>
@@ -1752,8 +2260,8 @@
       <w:r>
         <w:drawing>
           <wp:inline xmlns:a="http://schemas.openxmlformats.org/drawingml/2006/main" xmlns:pic="http://schemas.openxmlformats.org/drawingml/2006/picture">
-            <wp:extent cx="4023360" cy="3119967"/>
-            <wp:docPr id="7" name="Picture 7" descr="Photograph preserved from the source essay, or authentic Resisei Layla cover from the Akiva Publishing KDP cover PDF."/>
+            <wp:extent cx="4754880" cy="3687233"/>
+            <wp:docPr id="10" name="Picture 10"/>
             <wp:cNvGraphicFramePr>
               <a:graphicFrameLocks noChangeAspect="1"/>
             </wp:cNvGraphicFramePr>
@@ -1765,7 +2273,7 @@
                     <pic:cNvPicPr/>
                   </pic:nvPicPr>
                   <pic:blipFill>
-                    <a:blip r:embed="rId15"/>
+                    <a:blip r:embed="rId18"/>
                     <a:stretch>
                       <a:fillRect/>
                     </a:stretch>
@@ -1773,7 +2281,7 @@
                   <pic:spPr>
                     <a:xfrm>
                       <a:off x="0" y="0"/>
-                      <a:ext cx="4023360" cy="3119967"/>
+                      <a:ext cx="4754880" cy="3687233"/>
                     </a:xfrm>
                     <a:prstGeom prst="rect"/>
                   </pic:spPr>
@@ -1801,8 +2309,47 @@
       </w:r>
     </w:p>
     <w:p>
+      <w:r>
+        <w:rPr>
+          <w:rFonts w:ascii="Georgia" w:hAnsi="Georgia" w:eastAsia="Georgia" w:cs="Times New Roman"/>
+        </w:rPr>
+        <w:t xml:space="preserve">I do not want her remembered only for her illness, or even only for the way she faced it. She was an incredible woman who lived life to its fullest, and her love was not one heroic moment. It lived in the ordinary, daily acts of caring that made her who she was.</w:t>
+      </w:r>
+    </w:p>
+    <w:p>
+      <w:r>
+        <w:rPr>
+          <w:rFonts w:ascii="Georgia" w:hAnsi="Georgia" w:eastAsia="Georgia" w:cs="Times New Roman"/>
+        </w:rPr>
+        <w:t xml:space="preserve">And I keep coming back to that smile. Everything was not okay; a week later she was gone. But thirty-six years on, with Rav Tzadok’s help, I think I can hear what it was really saying. Not that the night would not come. That the night is not the whole story. That the One who gives the darkness also gives the light that comes out of it. And that we would go on. In that, she was right. In the end, we have been okay. Her mark is on every one of us, and I carry it with me always.</w:t>
+      </w:r>
+    </w:p>
+    <w:p>
+      <w:pPr>
+        <w:pBdr>
+          <w:top w:val="single" w:sz="6" w:space="10" w:color="C9A66B"/>
+          <w:bottom w:val="single" w:sz="6" w:space="10" w:color="C9A66B"/>
+        </w:pBdr>
+        <w:spacing w:before="200" w:after="320" w:line="300" w:lineRule="auto"/>
+        <w:ind w:left="1152" w:right="1152"/>
+        <w:jc w:val="center"/>
+      </w:pPr>
+      <w:r>
+        <w:rPr>
+          <w:rFonts w:ascii="Georgia" w:hAnsi="Georgia" w:eastAsia="Georgia" w:cs="Times New Roman"/>
+          <w:i/>
+          <w:color w:val="8A5A1F"/>
+          <w:sz w:val="30"/>
+          <w:szCs w:val="30"/>
+        </w:rPr>
+        <w:t xml:space="preserve">The night is not the whole story.</w:t>
+      </w:r>
+    </w:p>
+    <w:p>
       <w:pPr>
         <w:pStyle w:val="Heading1"/>
+        <w:pageBreakBefore/>
+        <w:spacing w:before="480"/>
       </w:pPr>
       <w:r>
         <w:rPr>
@@ -1816,10 +2363,58 @@
         <w:rPr>
           <w:rFonts w:ascii="Georgia" w:hAnsi="Georgia" w:eastAsia="Georgia" w:cs="Times New Roman"/>
         </w:rPr>
-        <w:t xml:space="preserve">If you would like to take part in this yahrzeit, here are a few small things.</w:t>
+        <w:t xml:space="preserve">If you would like to take part in this yahrzeit, here are a few small things, and three questions you are welcome to borrow.</w:t>
       </w:r>
     </w:p>
     <w:p>
+      <w:pPr>
+        <w:spacing w:after="180"/>
+        <w:ind w:left="317" w:hanging="317"/>
+        <w:jc w:val="left"/>
+      </w:pPr>
+      <w:r>
+        <w:drawing>
+          <wp:anchor distT="0" distB="91440" distL="182880" distR="0" simplePos="0" relativeHeight="251658744" behindDoc="0" locked="0" layoutInCell="1" allowOverlap="0">
+            <wp:simplePos x="0" y="0"/>
+            <wp:positionH relativeFrom="margin">
+              <wp:align>right</wp:align>
+            </wp:positionH>
+            <wp:positionV relativeFrom="paragraph">
+              <wp:posOffset>45720</wp:posOffset>
+            </wp:positionV>
+            <wp:extent cx="2240280" cy="3139440"/>
+            <wp:effectExtent l="0" t="0" r="0" b="0"/>
+            <wp:wrapSquare wrapText="bothSides"/>
+            <wp:docPr id="11" name="Picture 11"/>
+            <wp:cNvGraphicFramePr xmlns:a="http://schemas.openxmlformats.org/drawingml/2006/main">
+              <a:graphicFrameLocks noChangeAspect="1"/>
+            </wp:cNvGraphicFramePr>
+            <a:graphic xmlns:a="http://schemas.openxmlformats.org/drawingml/2006/main" xmlns:pic="http://schemas.openxmlformats.org/drawingml/2006/picture">
+              <a:graphicData uri="http://schemas.openxmlformats.org/drawingml/2006/picture">
+                <pic:pic>
+                  <pic:nvPicPr>
+                    <pic:cNvPr id="0" name="_cap_hug.jpg"/>
+                    <pic:cNvPicPr/>
+                  </pic:nvPicPr>
+                  <pic:blipFill>
+                    <a:blip r:embed="rId19"/>
+                    <a:stretch>
+                      <a:fillRect/>
+                    </a:stretch>
+                  </pic:blipFill>
+                  <pic:spPr>
+                    <a:xfrm>
+                      <a:off x="0" y="0"/>
+                      <a:ext cx="2240280" cy="3139440"/>
+                    </a:xfrm>
+                    <a:prstGeom prst="rect"/>
+                  </pic:spPr>
+                </pic:pic>
+              </a:graphicData>
+            </a:graphic>
+          </wp:anchor>
+        </w:drawing>
+      </w:r>
       <w:r>
         <w:rPr>
           <w:rFonts w:ascii="Georgia" w:hAnsi="Georgia" w:eastAsia="Georgia" w:cs="Times New Roman"/>
@@ -1841,6 +2436,11 @@
       </w:r>
     </w:p>
     <w:p>
+      <w:pPr>
+        <w:spacing w:after="180"/>
+        <w:ind w:left="317" w:hanging="317"/>
+        <w:jc w:val="left"/>
+      </w:pPr>
       <w:r>
         <w:rPr>
           <w:rFonts w:ascii="Georgia" w:hAnsi="Georgia" w:eastAsia="Georgia" w:cs="Times New Roman"/>
@@ -1875,6 +2475,11 @@
       </w:r>
     </w:p>
     <w:p>
+      <w:pPr>
+        <w:spacing w:after="180"/>
+        <w:ind w:left="317" w:hanging="317"/>
+        <w:jc w:val="left"/>
+      </w:pPr>
       <w:r>
         <w:rPr>
           <w:rFonts w:ascii="Georgia" w:hAnsi="Georgia" w:eastAsia="Georgia" w:cs="Times New Roman"/>
@@ -1896,6 +2501,11 @@
       </w:r>
     </w:p>
     <w:p>
+      <w:pPr>
+        <w:spacing w:after="180"/>
+        <w:ind w:left="317" w:hanging="317"/>
+        <w:jc w:val="left"/>
+      </w:pPr>
       <w:r>
         <w:rPr>
           <w:rFonts w:ascii="Georgia" w:hAnsi="Georgia" w:eastAsia="Georgia" w:cs="Times New Roman"/>
@@ -1917,105 +2527,129 @@
       </w:r>
     </w:p>
     <w:p>
+      <w:pPr>
+        <w:keepNext/>
+        <w:keepLines/>
+        <w:pBdr>
+          <w:left w:val="single" w:sz="24" w:space="10" w:color="C9A66B"/>
+        </w:pBdr>
+        <w:shd w:val="clear" w:color="auto" w:fill="F6F1E7"/>
+        <w:spacing w:before="280" w:after="0" w:line="384" w:lineRule="auto"/>
+        <w:ind w:left="432" w:right="432"/>
+        <w:jc w:val="left"/>
+      </w:pPr>
       <w:r>
         <w:rPr>
           <w:rFonts w:ascii="Georgia" w:hAnsi="Georgia" w:eastAsia="Georgia" w:cs="Times New Roman"/>
+          <w:b/>
+          <w:i/>
+          <w:color w:val="8A5A1F"/>
+          <w:sz w:val="21"/>
+          <w:szCs w:val="21"/>
         </w:rPr>
-        <w:t xml:space="preserve">Three questions I am asking myself this week, which you are welcome to borrow:</w:t>
-      </w:r>
-    </w:p>
-    <w:p>
-      <w:r>
-        <w:rPr>
-          <w:rFonts w:ascii="Georgia" w:hAnsi="Georgia" w:eastAsia="Georgia" w:cs="Times New Roman"/>
-        </w:rPr>
-        <w:t xml:space="preserve">•  Where am I living as if I were the doer, and what would it change to remember that I am not?</w:t>
-      </w:r>
-    </w:p>
-    <w:p>
-      <w:r>
-        <w:rPr>
-          <w:rFonts w:ascii="Georgia" w:hAnsi="Georgia" w:eastAsia="Georgia" w:cs="Times New Roman"/>
-        </w:rPr>
-        <w:t xml:space="preserve">•  Where is my night right now, and am I still giving inside it?</w:t>
-      </w:r>
-    </w:p>
-    <w:p>
-      <w:r>
-        <w:rPr>
-          <w:rFonts w:ascii="Georgia" w:hAnsi="Georgia" w:eastAsia="Georgia" w:cs="Times New Roman"/>
-        </w:rPr>
-        <w:t xml:space="preserve">•  Is there joy in my heart that I have been treating as something I must earn, when it is really a gift?</w:t>
+        <w:t xml:space="preserve">Three questions I am asking myself this week:</w:t>
       </w:r>
     </w:p>
     <w:p>
       <w:pPr>
         <w:keepNext/>
-        <w:spacing w:before="160" w:after="40"/>
-        <w:jc w:val="center"/>
+        <w:keepLines/>
+        <w:pBdr>
+          <w:left w:val="single" w:sz="24" w:space="10" w:color="C9A66B"/>
+        </w:pBdr>
+        <w:shd w:val="clear" w:color="auto" w:fill="F6F1E7"/>
+        <w:spacing w:before="0" w:after="80" w:line="324" w:lineRule="auto"/>
+        <w:ind w:left="792" w:right="432" w:hanging="360"/>
+        <w:jc w:val="left"/>
       </w:pPr>
       <w:r>
-        <w:drawing>
-          <wp:inline xmlns:a="http://schemas.openxmlformats.org/drawingml/2006/main" xmlns:pic="http://schemas.openxmlformats.org/drawingml/2006/picture">
-            <wp:extent cx="2194560" cy="2862927"/>
-            <wp:docPr id="8" name="Picture 8" descr="Photograph preserved from the source essay, or authentic Resisei Layla cover from the Akiva Publishing KDP cover PDF."/>
-            <wp:cNvGraphicFramePr>
-              <a:graphicFrameLocks noChangeAspect="1"/>
-            </wp:cNvGraphicFramePr>
-            <a:graphic>
-              <a:graphicData uri="http://schemas.openxmlformats.org/drawingml/2006/picture">
-                <pic:pic>
-                  <pic:nvPicPr>
-                    <pic:cNvPr id="0" name="hug.jpg"/>
-                    <pic:cNvPicPr/>
-                  </pic:nvPicPr>
-                  <pic:blipFill>
-                    <a:blip r:embed="rId16"/>
-                    <a:stretch>
-                      <a:fillRect/>
-                    </a:stretch>
-                  </pic:blipFill>
-                  <pic:spPr>
-                    <a:xfrm>
-                      <a:off x="0" y="0"/>
-                      <a:ext cx="2194560" cy="2862927"/>
-                    </a:xfrm>
-                    <a:prstGeom prst="rect"/>
-                  </pic:spPr>
-                </pic:pic>
-              </a:graphicData>
-            </a:graphic>
-          </wp:inline>
-        </w:drawing>
+        <w:rPr>
+          <w:rFonts w:ascii="Georgia" w:hAnsi="Georgia" w:eastAsia="Georgia" w:cs="Times New Roman"/>
+          <w:color w:val="222B33"/>
+          <w:sz w:val="22"/>
+          <w:szCs w:val="22"/>
+        </w:rPr>
+        <w:t xml:space="preserve">—  What are the things that truly matter in my life, and does the way I spend this week show it?</w:t>
       </w:r>
     </w:p>
     <w:p>
       <w:pPr>
-        <w:spacing w:after="240"/>
+        <w:keepNext/>
+        <w:keepLines/>
+        <w:pBdr>
+          <w:left w:val="single" w:sz="24" w:space="10" w:color="C9A66B"/>
+        </w:pBdr>
+        <w:shd w:val="clear" w:color="auto" w:fill="F6F1E7"/>
+        <w:spacing w:before="0" w:after="80" w:line="324" w:lineRule="auto"/>
+        <w:ind w:left="792" w:right="432" w:hanging="360"/>
+        <w:jc w:val="left"/>
+      </w:pPr>
+      <w:r>
+        <w:rPr>
+          <w:rFonts w:ascii="Georgia" w:hAnsi="Georgia" w:eastAsia="Georgia" w:cs="Times New Roman"/>
+          <w:color w:val="222B33"/>
+          <w:sz w:val="22"/>
+          <w:szCs w:val="22"/>
+        </w:rPr>
+        <w:t xml:space="preserve">—  Where am I living as if I were the doer, and what would it change to remember that I am not?</w:t>
+      </w:r>
+    </w:p>
+    <w:p>
+      <w:pPr>
+        <w:keepNext w:val="0"/>
+        <w:keepLines/>
+        <w:pBdr>
+          <w:left w:val="single" w:sz="24" w:space="10" w:color="C9A66B"/>
+        </w:pBdr>
+        <w:shd w:val="clear" w:color="auto" w:fill="F6F1E7"/>
+        <w:spacing w:before="0" w:after="320" w:line="324" w:lineRule="auto"/>
+        <w:ind w:left="792" w:right="432" w:hanging="360"/>
+        <w:jc w:val="left"/>
+      </w:pPr>
+      <w:r>
+        <w:rPr>
+          <w:rFonts w:ascii="Georgia" w:hAnsi="Georgia" w:eastAsia="Georgia" w:cs="Times New Roman"/>
+          <w:color w:val="222B33"/>
+          <w:sz w:val="22"/>
+          <w:szCs w:val="22"/>
+        </w:rPr>
+        <w:t xml:space="preserve">—  Where is my night right now, and am I still giving inside it?</w:t>
+      </w:r>
+    </w:p>
+    <w:p>
+      <w:pPr>
+        <w:spacing w:before="120" w:after="0"/>
+        <w:jc w:val="center"/>
+      </w:pPr>
+    </w:p>
+    <w:p>
+      <w:pPr>
+        <w:spacing w:before="160" w:after="40" w:line="312" w:lineRule="auto"/>
         <w:jc w:val="center"/>
       </w:pPr>
       <w:r>
         <w:rPr>
           <w:rFonts w:ascii="Georgia" w:hAnsi="Georgia" w:eastAsia="Georgia" w:cs="Times New Roman"/>
           <w:i/>
-          <w:color w:val="5F666D"/>
-          <w:sz w:val="19"/>
-          <w:szCs w:val="19"/>
+          <w:color w:val="8A5A1F"/>
+          <w:sz w:val="26"/>
+          <w:szCs w:val="26"/>
         </w:rPr>
-        <w:t xml:space="preserve">A moment at a simchah.</w:t>
+        <w:t xml:space="preserve">May her neshamah have an aliyah, and may her memory be a blessing.</w:t>
       </w:r>
     </w:p>
     <w:p>
-      <w:r>
-        <w:rPr>
-          <w:rFonts w:ascii="Georgia" w:hAnsi="Georgia" w:eastAsia="Georgia" w:cs="Times New Roman"/>
-        </w:rPr>
-        <w:t xml:space="preserve">May her memory be a blessing. </w:t>
-      </w:r>
+      <w:pPr>
+        <w:spacing w:before="40" w:after="40" w:line="312" w:lineRule="auto"/>
+        <w:jc w:val="center"/>
+      </w:pPr>
       <w:r>
         <w:rPr>
           <w:rFonts w:ascii="Georgia" w:hAnsi="Georgia" w:eastAsia="Georgia" w:cs="Times New Roman"/>
           <w:i/>
+          <w:color w:val="8A5A1F"/>
+          <w:sz w:val="28"/>
+          <w:szCs w:val="28"/>
         </w:rPr>
         <w:t xml:space="preserve">Yehi zichra baruch.</w:t>
       </w:r>
@@ -2023,6 +2657,8 @@
     <w:p>
       <w:pPr>
         <w:pStyle w:val="Heading1"/>
+        <w:pageBreakBefore/>
+        <w:spacing w:before="480"/>
       </w:pPr>
       <w:r>
         <w:rPr>
@@ -2060,32 +2696,27 @@
         <w:tblLook w:firstColumn="1" w:firstRow="1" w:lastColumn="0" w:lastRow="0" w:noHBand="0" w:noVBand="1" w:val="04A0"/>
       </w:tblPr>
       <w:tblGrid>
-        <w:gridCol w:w="4421"/>
-        <w:gridCol w:w="4421"/>
+        <w:gridCol w:w="3888"/>
+        <w:gridCol w:w="3888"/>
       </w:tblGrid>
       <w:tr>
+        <w:trPr>
+          <w:cantSplit/>
+        </w:trPr>
         <w:tc>
           <w:tcPr>
-            <w:tcW w:type="dxa" w:w="4421"/>
-            <w:vAlign w:val="center"/>
-            <w:tcBorders>
-              <w:top w:val="nil"/>
-              <w:left w:val="nil"/>
-              <w:bottom w:val="nil"/>
-              <w:right w:val="nil"/>
-              <w:insideH w:val="nil"/>
-              <w:insideV w:val="nil"/>
-            </w:tcBorders>
+            <w:tcW w:type="dxa" w:w="3888"/>
           </w:tcPr>
           <w:p>
             <w:pPr>
+              <w:spacing w:before="200" w:after="120"/>
               <w:jc w:val="center"/>
             </w:pPr>
             <w:r>
               <w:drawing>
                 <wp:inline xmlns:a="http://schemas.openxmlformats.org/drawingml/2006/main" xmlns:pic="http://schemas.openxmlformats.org/drawingml/2006/picture">
-                  <wp:extent cx="2505456" cy="3990009"/>
-                  <wp:docPr id="10" name="Picture 10" descr="Photograph preserved from the source essay, or authentic Resisei Layla cover from the Akiva Publishing KDP cover PDF."/>
+                  <wp:extent cx="2148840" cy="3422088"/>
+                  <wp:docPr id="12" name="Picture 12"/>
                   <wp:cNvGraphicFramePr>
                     <a:graphicFrameLocks noChangeAspect="1"/>
                   </wp:cNvGraphicFramePr>
@@ -2093,7 +2724,102 @@
                     <a:graphicData uri="http://schemas.openxmlformats.org/drawingml/2006/picture">
                       <pic:pic>
                         <pic:nvPicPr>
-                          <pic:cNvPr id="0" name="Resisei_Layla_Volume_I_Actual_Front.jpg"/>
+                          <pic:cNvPr id="0" name="image10.jpg"/>
+                          <pic:cNvPicPr/>
+                        </pic:nvPicPr>
+                        <pic:blipFill>
+                          <a:blip r:embed="rId20"/>
+                          <a:stretch>
+                            <a:fillRect/>
+                          </a:stretch>
+                        </pic:blipFill>
+                        <pic:spPr>
+                          <a:xfrm>
+                            <a:off x="0" y="0"/>
+                            <a:ext cx="2148840" cy="3422088"/>
+                          </a:xfrm>
+                          <a:prstGeom prst="rect"/>
+                        </pic:spPr>
+                      </pic:pic>
+                    </a:graphicData>
+                  </a:graphic>
+                </wp:inline>
+              </w:drawing>
+            </w:r>
+          </w:p>
+          <w:p>
+            <w:pPr>
+              <w:spacing w:after="20"/>
+              <w:jc w:val="center"/>
+            </w:pPr>
+            <w:r>
+              <w:rPr>
+                <w:rFonts w:ascii="Georgia" w:hAnsi="Georgia" w:eastAsia="Georgia" w:cs="Times New Roman"/>
+                <w:b/>
+                <w:color w:val="222B33"/>
+                <w:sz w:val="22"/>
+                <w:szCs w:val="22"/>
+              </w:rPr>
+              <w:t xml:space="preserve">Resisei Layla, Volume I</w:t>
+            </w:r>
+          </w:p>
+          <w:p>
+            <w:pPr>
+              <w:spacing w:after="80"/>
+              <w:jc w:val="center"/>
+            </w:pPr>
+            <w:r>
+              <w:rPr>
+                <w:rFonts w:ascii="Georgia" w:hAnsi="Georgia" w:eastAsia="Georgia" w:cs="Times New Roman"/>
+                <w:i/>
+                <w:color w:val="5F666D"/>
+                <w:sz w:val="19"/>
+                <w:szCs w:val="19"/>
+              </w:rPr>
+              <w:t xml:space="preserve">Simanim 1–42</w:t>
+            </w:r>
+          </w:p>
+          <w:p>
+            <w:pPr>
+              <w:spacing w:after="80"/>
+              <w:jc w:val="center"/>
+            </w:pPr>
+            <w:hyperlink r:id="rId21">
+              <w:r>
+                <w:rPr>
+                  <w:rFonts w:ascii="Georgia" w:hAnsi="Georgia" w:eastAsia="Georgia" w:cs="Times New Roman"/>
+                  <w:b/>
+                  <w:color w:val="1F4E8C"/>
+                  <w:sz w:val="21"/>
+                  <w:u w:val="single"/>
+                </w:rPr>
+                <w:t xml:space="preserve">Buy on Amazon  ›</w:t>
+              </w:r>
+            </w:hyperlink>
+          </w:p>
+        </w:tc>
+        <w:tc>
+          <w:tcPr>
+            <w:tcW w:type="dxa" w:w="3888"/>
+          </w:tcPr>
+          <w:p>
+            <w:pPr>
+              <w:spacing w:before="200" w:after="120"/>
+              <w:jc w:val="center"/>
+            </w:pPr>
+            <w:r>
+              <w:drawing>
+                <wp:inline xmlns:a="http://schemas.openxmlformats.org/drawingml/2006/main" xmlns:pic="http://schemas.openxmlformats.org/drawingml/2006/picture">
+                  <wp:extent cx="2148840" cy="3452080"/>
+                  <wp:docPr id="13" name="Picture 13"/>
+                  <wp:cNvGraphicFramePr>
+                    <a:graphicFrameLocks noChangeAspect="1"/>
+                  </wp:cNvGraphicFramePr>
+                  <a:graphic>
+                    <a:graphicData uri="http://schemas.openxmlformats.org/drawingml/2006/picture">
+                      <pic:pic>
+                        <pic:nvPicPr>
+                          <pic:cNvPr id="0" name="image11.jpg"/>
                           <pic:cNvPicPr/>
                         </pic:nvPicPr>
                         <pic:blipFill>
@@ -2105,7 +2831,7 @@
                         <pic:spPr>
                           <a:xfrm>
                             <a:off x="0" y="0"/>
-                            <a:ext cx="2505456" cy="3990009"/>
+                            <a:ext cx="2148840" cy="3452080"/>
                           </a:xfrm>
                           <a:prstGeom prst="rect"/>
                         </pic:spPr>
@@ -2116,167 +2842,69 @@
               </w:drawing>
             </w:r>
           </w:p>
-        </w:tc>
-        <w:tc>
-          <w:tcPr>
-            <w:tcW w:type="dxa" w:w="4421"/>
-            <w:vAlign w:val="center"/>
-            <w:tcBorders>
-              <w:top w:val="nil"/>
-              <w:left w:val="nil"/>
-              <w:bottom w:val="nil"/>
-              <w:right w:val="nil"/>
-              <w:insideH w:val="nil"/>
-              <w:insideV w:val="nil"/>
-            </w:tcBorders>
-          </w:tcPr>
           <w:p>
             <w:pPr>
-              <w:jc w:val="center"/>
-            </w:pPr>
-            <w:r>
-              <w:drawing>
-                <wp:inline xmlns:a="http://schemas.openxmlformats.org/drawingml/2006/main" xmlns:pic="http://schemas.openxmlformats.org/drawingml/2006/picture">
-                  <wp:extent cx="2505456" cy="4024979"/>
-                  <wp:docPr id="11" name="Picture 11" descr="Photograph preserved from the source essay, or authentic Resisei Layla cover from the Akiva Publishing KDP cover PDF."/>
-                  <wp:cNvGraphicFramePr>
-                    <a:graphicFrameLocks noChangeAspect="1"/>
-                  </wp:cNvGraphicFramePr>
-                  <a:graphic>
-                    <a:graphicData uri="http://schemas.openxmlformats.org/drawingml/2006/picture">
-                      <pic:pic>
-                        <pic:nvPicPr>
-                          <pic:cNvPr id="0" name="Resisei_Layla_Volume_II_Actual_Front.jpg"/>
-                          <pic:cNvPicPr/>
-                        </pic:nvPicPr>
-                        <pic:blipFill>
-                          <a:blip r:embed="rId23"/>
-                          <a:stretch>
-                            <a:fillRect/>
-                          </a:stretch>
-                        </pic:blipFill>
-                        <pic:spPr>
-                          <a:xfrm>
-                            <a:off x="0" y="0"/>
-                            <a:ext cx="2505456" cy="4024979"/>
-                          </a:xfrm>
-                          <a:prstGeom prst="rect"/>
-                        </pic:spPr>
-                      </pic:pic>
-                    </a:graphicData>
-                  </a:graphic>
-                </wp:inline>
-              </w:drawing>
-            </w:r>
-          </w:p>
-        </w:tc>
-      </w:tr>
-      <w:tr>
-        <w:tc>
-          <w:tcPr>
-            <w:tcW w:type="dxa" w:w="4421"/>
-            <w:tcBorders>
-              <w:top w:val="nil"/>
-              <w:left w:val="nil"/>
-              <w:bottom w:val="nil"/>
-              <w:right w:val="nil"/>
-              <w:insideH w:val="nil"/>
-              <w:insideV w:val="nil"/>
-            </w:tcBorders>
-          </w:tcPr>
-          <w:p>
-            <w:pPr>
-              <w:spacing w:before="40" w:after="200"/>
+              <w:spacing w:after="20"/>
               <w:jc w:val="center"/>
             </w:pPr>
             <w:r>
               <w:rPr>
-                <w:i/>
-                <w:color w:val="694F36"/>
-                <w:sz w:val="18"/>
+                <w:rFonts w:ascii="Georgia" w:hAnsi="Georgia" w:eastAsia="Georgia" w:cs="Times New Roman"/>
+                <w:b/>
+                <w:color w:val="222B33"/>
+                <w:sz w:val="22"/>
+                <w:szCs w:val="22"/>
               </w:rPr>
-              <w:t>Volume I  ·  Simanim 1–42</w:t>
+              <w:t xml:space="preserve">Resisei Layla, Volume II</w:t>
             </w:r>
           </w:p>
-        </w:tc>
-        <w:tc>
-          <w:tcPr>
-            <w:tcW w:type="dxa" w:w="4421"/>
-            <w:tcBorders>
-              <w:top w:val="nil"/>
-              <w:left w:val="nil"/>
-              <w:bottom w:val="nil"/>
-              <w:right w:val="nil"/>
-              <w:insideH w:val="nil"/>
-              <w:insideV w:val="nil"/>
-            </w:tcBorders>
-          </w:tcPr>
           <w:p>
             <w:pPr>
-              <w:spacing w:before="40" w:after="200"/>
+              <w:spacing w:after="80"/>
               <w:jc w:val="center"/>
             </w:pPr>
             <w:r>
               <w:rPr>
+                <w:rFonts w:ascii="Georgia" w:hAnsi="Georgia" w:eastAsia="Georgia" w:cs="Times New Roman"/>
                 <w:i/>
-                <w:color w:val="694F36"/>
-                <w:sz w:val="18"/>
+                <w:color w:val="5F666D"/>
+                <w:sz w:val="19"/>
+                <w:szCs w:val="19"/>
               </w:rPr>
-              <w:t>Volume II  ·  Simanim 43–58</w:t>
+              <w:t xml:space="preserve">Simanim 43–58</w:t>
             </w:r>
+          </w:p>
+          <w:p>
+            <w:pPr>
+              <w:spacing w:after="80"/>
+              <w:jc w:val="center"/>
+            </w:pPr>
+            <w:hyperlink r:id="rId23">
+              <w:r>
+                <w:rPr>
+                  <w:rFonts w:ascii="Georgia" w:hAnsi="Georgia" w:eastAsia="Georgia" w:cs="Times New Roman"/>
+                  <w:b/>
+                  <w:color w:val="1F4E8C"/>
+                  <w:sz w:val="21"/>
+                  <w:u w:val="single"/>
+                </w:rPr>
+                <w:t xml:space="preserve">Buy on Amazon  ›</w:t>
+              </w:r>
+            </w:hyperlink>
           </w:p>
         </w:tc>
       </w:tr>
     </w:tbl>
     <w:p>
       <w:pPr>
-        <w:spacing w:before="80" w:after="80"/>
-        <w:ind w:left="504" w:right="504"/>
-        <w:pBdr>
-          <w:left w:val="single" w:sz="24" w:space="10" w:color="C9A66B"/>
-        </w:pBdr>
-        <w:shd w:val="clear" w:color="auto" w:fill="F6F1E7"/>
+        <w:spacing w:after="120"/>
       </w:pPr>
-      <w:hyperlink r:id="rId17">
-        <w:r>
-          <w:rPr>
-            <w:rFonts w:ascii="Georgia" w:hAnsi="Georgia" w:eastAsia="Georgia" w:cs="Times New Roman"/>
-            <w:b/>
-            <w:color w:val="1F4E8C"/>
-            <w:sz w:val="24"/>
-            <w:u w:val="single"/>
-          </w:rPr>
-          <w:t>Resisei Layla, Volume I  →  Buy on Amazon</w:t>
-        </w:r>
-      </w:hyperlink>
     </w:p>
     <w:p>
       <w:pPr>
-        <w:spacing w:before="80" w:after="80"/>
-        <w:ind w:left="504" w:right="504"/>
-        <w:pBdr>
-          <w:left w:val="single" w:sz="24" w:space="10" w:color="C9A66B"/>
-        </w:pBdr>
-        <w:shd w:val="clear" w:color="auto" w:fill="F6F1E7"/>
-      </w:pPr>
-      <w:hyperlink r:id="rId18">
-        <w:r>
-          <w:rPr>
-            <w:rFonts w:ascii="Georgia" w:hAnsi="Georgia" w:eastAsia="Georgia" w:cs="Times New Roman"/>
-            <w:b/>
-            <w:color w:val="1F4E8C"/>
-            <w:sz w:val="24"/>
-            <w:u w:val="single"/>
-          </w:rPr>
-          <w:t>Resisei Layla, Volume II  →  Buy on Amazon</w:t>
-        </w:r>
-      </w:hyperlink>
-    </w:p>
-    <w:p>
-      <w:pPr>
+        <w:bidi/>
         <w:spacing w:before="200" w:after="40"/>
         <w:jc w:val="center"/>
-        <w:bidi/>
       </w:pPr>
       <w:r>
         <w:rPr>
@@ -2291,9 +2919,9 @@
     </w:p>
     <w:p>
       <w:pPr>
+        <w:bidi/>
         <w:spacing w:before="200" w:after="40"/>
         <w:jc w:val="center"/>
-        <w:bidi/>
       </w:pPr>
       <w:r>
         <w:rPr>
@@ -2307,11 +2935,14 @@
       </w:r>
     </w:p>
     <w:sectPr>
-      <w:headerReference w:type="default" r:id="rId19"/>
-      <w:footerReference w:type="default" r:id="rId20"/>
+      <w:headerReference w:type="default" r:id="rId24"/>
+      <w:footerReference w:type="default" r:id="rId25"/>
+      <w:headerReference w:type="first" r:id="rId26"/>
+      <w:footerReference w:type="first" r:id="rId27"/>
       <w:pgSz w:w="12240" w:h="15840"/>
       <w:pgMar w:top="1440" w:right="1440" w:bottom="1440" w:left="1440" w:header="720" w:footer="720" w:gutter="0"/>
       <w:cols w:space="720"/>
+      <w:titlePg/>
       <w:docGrid w:linePitch="360"/>
     </w:sectPr>
   </w:body>
@@ -2335,6 +2966,16 @@
       <w:fldChar w:fldCharType="separate"/>
       <w:fldChar w:fldCharType="end"/>
     </w:r>
+  </w:p>
+</w:ftr>
+</file>
+
+<file path=word/footer2.xml><?xml version="1.0" encoding="utf-8"?>
+<w:ftr xmlns:m="http://schemas.openxmlformats.org/officeDocument/2006/math" xmlns:mc="http://schemas.openxmlformats.org/markup-compatibility/2006" xmlns:mo="http://schemas.microsoft.com/office/mac/office/2008/main" xmlns:mv="urn:schemas-microsoft-com:mac:vml" xmlns:o="urn:schemas-microsoft-com:office:office" xmlns:r="http://schemas.openxmlformats.org/officeDocument/2006/relationships" xmlns:v="urn:schemas-microsoft-com:vml" xmlns:w10="urn:schemas-microsoft-com:office:word" xmlns:w14="http://schemas.microsoft.com/office/word/2010/wordml" xmlns:w="http://schemas.openxmlformats.org/wordprocessingml/2006/main" xmlns:wne="http://schemas.microsoft.com/office/word/2006/wordml" xmlns:wp14="http://schemas.microsoft.com/office/word/2010/wordprocessingDrawing" xmlns:wp="http://schemas.openxmlformats.org/drawingml/2006/wordprocessingDrawing" xmlns:wpc="http://schemas.microsoft.com/office/word/2010/wordprocessingCanvas" xmlns:wpg="http://schemas.microsoft.com/office/word/2010/wordprocessingGroup" xmlns:wpi="http://schemas.microsoft.com/office/word/2010/wordprocessingInk" xmlns:wps="http://schemas.microsoft.com/office/word/2010/wordprocessingShape" mc:Ignorable="w14 wp14">
+  <w:p>
+    <w:pPr>
+      <w:pStyle w:val="Footer"/>
+    </w:pPr>
   </w:p>
 </w:ftr>
 </file>
@@ -2652,7 +3293,7 @@
           <w:sz w:val="16"/>
           <w:szCs w:val="16"/>
         </w:rPr>
-        <w:t xml:space="preserve">Niddah 16b: at conception it is decreed whether the drop will become wise or foolish, rich or poor. Rav Tzadok relates “rich” to the joy of the heart.</w:t>
+        <w:t xml:space="preserve">Shabbat 77b: “First darkness, and afterward light.” Rav Tzadok illustrates the principle with the Exodus before the giving of the Torah, and the captivity of the Ark among the Philistines before the building of the Temple.</w:t>
       </w:r>
     </w:p>
   </w:footnote>
@@ -2682,7 +3323,7 @@
           <w:sz w:val="16"/>
           <w:szCs w:val="16"/>
         </w:rPr>
-        <w:t xml:space="preserve">Pirkei Avot 4:1 (“Who is rich? One who rejoices in his portion”). Rav Tzadok also cites Jerusalem Talmud, Terumot 8:12, “the heart depends on the purse.”</w:t>
+        <w:t xml:space="preserve">Niddah 16b: at conception it is decreed whether the drop will become wise or foolish, rich or poor. Rav Tzadok relates “rich” to the joy of the heart.</w:t>
       </w:r>
     </w:p>
   </w:footnote>
@@ -2712,41 +3353,11 @@
           <w:sz w:val="16"/>
           <w:szCs w:val="16"/>
         </w:rPr>
-        <w:t xml:space="preserve">Avodah Zarah 3a. Rashi explains that “the eve of Shabbat” is this world. Rav Tzadok cites this at the end of Siman 1.</w:t>
+        <w:t xml:space="preserve">Pirkei Avot 4:1 (“Who is rich? One who rejoices in his portion”). Rav Tzadok also cites Jerusalem Talmud, Terumot 8:12, “the heart depends on the purse.”</w:t>
       </w:r>
     </w:p>
   </w:footnote>
   <w:footnote w:id="10">
-    <w:p>
-      <w:pPr>
-        <w:spacing w:after="40" w:line="240" w:lineRule="auto"/>
-        <w:jc w:val="left"/>
-      </w:pPr>
-      <w:r>
-        <w:rPr>
-          <w:rFonts w:ascii="Georgia" w:hAnsi="Georgia"/>
-          <w:vertAlign w:val="superscript"/>
-          <w:sz w:val="17"/>
-        </w:rPr>
-        <w:footnoteRef/>
-      </w:r>
-      <w:r>
-        <w:rPr>
-          <w:sz w:val="17"/>
-        </w:rPr>
-        <w:t xml:space="preserve"> </w:t>
-      </w:r>
-      <w:r>
-        <w:rPr>
-          <w:rFonts w:ascii="Georgia" w:hAnsi="Georgia" w:cs="Georgia"/>
-          <w:sz w:val="16"/>
-          <w:szCs w:val="16"/>
-        </w:rPr>
-        <w:t xml:space="preserve">Sukkah 52a: “Whoever is greater than his fellow, his inclination is greater than he.” Rav Tzadok also cites Zohar III 216a on the Generation of the Flood, who were fit to receive the Torah.</w:t>
-      </w:r>
-    </w:p>
-  </w:footnote>
-  <w:footnote w:id="11">
     <w:p>
       <w:pPr>
         <w:spacing w:after="40" w:line="240" w:lineRule="auto"/>
@@ -2796,6 +3407,16 @@
       </w:rPr>
       <w:t xml:space="preserve">Faith in the Night</w:t>
     </w:r>
+  </w:p>
+</w:hdr>
+</file>
+
+<file path=word/header2.xml><?xml version="1.0" encoding="utf-8"?>
+<w:hdr xmlns:m="http://schemas.openxmlformats.org/officeDocument/2006/math" xmlns:mc="http://schemas.openxmlformats.org/markup-compatibility/2006" xmlns:mo="http://schemas.microsoft.com/office/mac/office/2008/main" xmlns:mv="urn:schemas-microsoft-com:mac:vml" xmlns:o="urn:schemas-microsoft-com:office:office" xmlns:r="http://schemas.openxmlformats.org/officeDocument/2006/relationships" xmlns:v="urn:schemas-microsoft-com:vml" xmlns:w10="urn:schemas-microsoft-com:office:word" xmlns:w14="http://schemas.microsoft.com/office/word/2010/wordml" xmlns:w="http://schemas.openxmlformats.org/wordprocessingml/2006/main" xmlns:wne="http://schemas.microsoft.com/office/word/2006/wordml" xmlns:wp14="http://schemas.microsoft.com/office/word/2010/wordprocessingDrawing" xmlns:wp="http://schemas.openxmlformats.org/drawingml/2006/wordprocessingDrawing" xmlns:wpc="http://schemas.microsoft.com/office/word/2010/wordprocessingCanvas" xmlns:wpg="http://schemas.microsoft.com/office/word/2010/wordprocessingGroup" xmlns:wpi="http://schemas.microsoft.com/office/word/2010/wordprocessingInk" xmlns:wps="http://schemas.microsoft.com/office/word/2010/wordprocessingShape" mc:Ignorable="w14 wp14">
+  <w:p>
+    <w:pPr>
+      <w:pStyle w:val="Header"/>
+    </w:pPr>
   </w:p>
 </w:hdr>
 </file>
@@ -3164,12 +3785,14 @@
     <w:qFormat/>
     <w:rsid w:val="00FC693F"/>
     <w:pPr>
+      <w:widowControl/>
       <w:spacing w:after="180" w:line="300" w:lineRule="auto"/>
+      <w:jc w:val="both"/>
     </w:pPr>
     <w:rPr>
       <w:rFonts w:ascii="Georgia" w:hAnsi="Georgia" w:eastAsia="Georgia" w:cs="Times New Roman"/>
       <w:color w:val="222B33"/>
-      <w:sz w:val="22"/>
+      <w:sz w:val="23"/>
     </w:rPr>
   </w:style>
   <w:style w:type="paragraph" w:styleId="Header">
@@ -3228,6 +3851,7 @@
       <w:keepNext/>
       <w:keepLines/>
       <w:spacing w:before="520" w:after="160" w:line="264" w:lineRule="auto"/>
+      <w:jc w:val="left"/>
       <w:outlineLvl w:val="0"/>
     </w:pPr>
     <w:rPr>

</xml_diff>